<commit_message>
Pre-fill content checklist with current copy and draft examples
Co-Authored-By: Claude Opus 5.5 <noreply@anthropic.com>
Claude-Session: https://claude.ai/code/session_01MP287J4ytmKJQmpMcNBeyF
</commit_message>
<xml_diff>
--- a/docs/Infinite-Sports-网站内容收集清单.docx
+++ b/docs/Infinite-Sports-网站内容收集清单.docx
@@ -45,7 +45,7 @@
           <w:sz w:val="21"/>
           <w:szCs w:val="21"/>
         </w:rPr>
-        <w:t xml:space="preserve">用于收集需要替换或补充到网站上的文字与图片。请在每张表格的浅黄色列中填写。</w:t>
+        <w:t xml:space="preserve">用于收集需要替换或补充到网站上的文字与图片。浅黄色列已预填建议内容，请直接修改。</w:t>
       </w:r>
     </w:p>
     <w:p>
@@ -64,7 +64,7 @@
           <w:sz w:val="20"/>
           <w:szCs w:val="20"/>
         </w:rPr>
-        <w:t xml:space="preserve">Please fill in the light-yellow column of each table with the text or image you want on the website.</w:t>
+        <w:t xml:space="preserve">The light-yellow column is pre-filled — please review and edit it directly.</w:t>
       </w:r>
     </w:p>
     <w:tbl>
@@ -417,7 +417,7 @@
                 <w:sz w:val="19"/>
                 <w:szCs w:val="19"/>
               </w:rPr>
-              <w:t xml:space="preserve">v1 · 2026-10-01</w:t>
+              <w:t xml:space="preserve">v2（已预填）· 2026-10-01</w:t>
             </w:r>
           </w:p>
         </w:tc>
@@ -457,7 +457,7 @@
           <w:sz w:val="20"/>
           <w:szCs w:val="20"/>
         </w:rPr>
-        <w:t xml:space="preserve">在「新内容」列写上新的文字。</w:t>
+        <w:t xml:space="preserve">「新内容」列已预填当前文案或建议草稿，直接在上面修改即可。</w:t>
       </w:r>
       <w:r>
         <w:rPr>
@@ -465,7 +465,55 @@
           <w:sz w:val="20"/>
           <w:szCs w:val="20"/>
         </w:rPr>
-        <w:t xml:space="preserve">留空 = 保留当前内容；写「删除 / Remove」= 从页面去掉该项。</w:t>
+        <w:t xml:space="preserve">不需改动就保持原样；写「删除 / Remove」= 从页面去掉该项。</w:t>
+      </w:r>
+    </w:p>
+    <w:p>
+      <w:pPr>
+        <w:pStyle w:val="ListParagraph"/>
+        <w:numPr>
+          <w:ilvl w:val="0"/>
+          <w:numId w:val="2"/>
+        </w:numPr>
+        <w:spacing w:after="60"/>
+      </w:pPr>
+      <w:r>
+        <w:rPr>
+          <w:rFonts w:ascii="Arial" w:cs="Arial" w:eastAsia="Microsoft YaHei" w:hAnsi="Arial"/>
+          <w:b/>
+          <w:bCs/>
+          <w:color w:val="E8590C"/>
+          <w:sz w:val="20"/>
+          <w:szCs w:val="20"/>
+        </w:rPr>
+        <w:t xml:space="preserve">【请填写】</w:t>
+      </w:r>
+      <w:r>
+        <w:rPr>
+          <w:rFonts w:ascii="Arial" w:cs="Arial" w:eastAsia="Microsoft YaHei" w:hAnsi="Arial"/>
+          <w:sz w:val="20"/>
+          <w:szCs w:val="20"/>
+        </w:rPr>
+        <w:t xml:space="preserve">、</w:t>
+      </w:r>
+      <w:r>
+        <w:rPr>
+          <w:rFonts w:ascii="Arial" w:cs="Arial" w:eastAsia="Microsoft YaHei" w:hAnsi="Arial"/>
+          <w:b/>
+          <w:bCs/>
+          <w:color w:val="E8590C"/>
+          <w:sz w:val="20"/>
+          <w:szCs w:val="20"/>
+        </w:rPr>
+        <w:t xml:space="preserve">【示例】</w:t>
+      </w:r>
+      <w:r>
+        <w:rPr>
+          <w:rFonts w:ascii="Arial" w:cs="Arial" w:eastAsia="Microsoft YaHei" w:hAnsi="Arial"/>
+          <w:sz w:val="20"/>
+          <w:szCs w:val="20"/>
+        </w:rPr>
+        <w:t xml:space="preserve"> 标记的内容是占位或示例，请务必替换成真实信息（替换后可删掉标记）。</w:t>
       </w:r>
     </w:p>
     <w:p>
@@ -483,7 +531,7 @@
           <w:sz w:val="20"/>
           <w:szCs w:val="20"/>
         </w:rPr>
-        <w:t xml:space="preserve">Write the new wording in the “New text” column. Leave it blank to keep the current text; write “Remove” to delete the item.</w:t>
+        <w:t xml:space="preserve">The “New text” column is pre-filled with the current or draft copy — just edit it. Items tagged 【请填写】/【示例】 are placeholders and must be replaced. Write “Remove” to delete an item.</w:t>
       </w:r>
     </w:p>
     <w:p>
@@ -1032,7 +1080,7 @@
                 <w:sz w:val="19"/>
                 <w:szCs w:val="19"/>
               </w:rPr>
-              <w:t xml:space="preserve"/>
+              <w:t xml:space="preserve">Infinite Sports</w:t>
             </w:r>
           </w:p>
         </w:tc>
@@ -1216,10 +1264,22 @@
             <w:r>
               <w:rPr>
                 <w:rFonts w:ascii="Arial" w:cs="Arial" w:eastAsia="Microsoft YaHei" w:hAnsi="Arial"/>
+                <w:b/>
+                <w:bCs/>
+                <w:color w:val="E8590C"/>
+                <w:sz w:val="17"/>
+                <w:szCs w:val="17"/>
+              </w:rPr>
+              <w:t xml:space="preserve">【请填写】</w:t>
+            </w:r>
+            <w:r>
+              <w:rPr>
+                <w:rFonts w:ascii="Arial" w:cs="Arial" w:eastAsia="Microsoft YaHei" w:hAnsi="Arial"/>
+                <w:color w:val="1D4ED8"/>
                 <w:sz w:val="19"/>
                 <w:szCs w:val="19"/>
               </w:rPr>
-              <w:t xml:space="preserve"/>
+              <w:t xml:space="preserve">https://（报名表网址）</w:t>
             </w:r>
           </w:p>
         </w:tc>
@@ -1390,7 +1450,7 @@
                 <w:sz w:val="19"/>
                 <w:szCs w:val="19"/>
               </w:rPr>
-              <w:t xml:space="preserve"/>
+              <w:t xml:space="preserve">Infinite Sports | Youth Sports Academy</w:t>
             </w:r>
           </w:p>
         </w:tc>
@@ -1577,7 +1637,7 @@
                 <w:sz w:val="19"/>
                 <w:szCs w:val="19"/>
               </w:rPr>
-              <w:t xml:space="preserve"/>
+              <w:t xml:space="preserve">Youth volleyball, basketball, and core training built around strong fundamentals, confidence, and long-term growth.</w:t>
             </w:r>
           </w:p>
         </w:tc>
@@ -1748,7 +1808,7 @@
                 <w:sz w:val="19"/>
                 <w:szCs w:val="19"/>
               </w:rPr>
-              <w:t xml:space="preserve"/>
+              <w:t xml:space="preserve">Infinite Sports | Build the Athlete Within</w:t>
             </w:r>
           </w:p>
         </w:tc>
@@ -1932,10 +1992,22 @@
             <w:r>
               <w:rPr>
                 <w:rFonts w:ascii="Arial" w:cs="Arial" w:eastAsia="Microsoft YaHei" w:hAnsi="Arial"/>
+                <w:b/>
+                <w:bCs/>
+                <w:color w:val="E8590C"/>
+                <w:sz w:val="17"/>
+                <w:szCs w:val="17"/>
+              </w:rPr>
+              <w:t xml:space="preserve">【示例】</w:t>
+            </w:r>
+            <w:r>
+              <w:rPr>
+                <w:rFonts w:ascii="Arial" w:cs="Arial" w:eastAsia="Microsoft YaHei" w:hAnsi="Arial"/>
+                <w:color w:val="1D4ED8"/>
                 <w:sz w:val="19"/>
                 <w:szCs w:val="19"/>
               </w:rPr>
-              <w:t xml:space="preserve"/>
+              <w:t xml:space="preserve">www.infinitesports.com（如暂无，保留临时地址）</w:t>
             </w:r>
           </w:p>
         </w:tc>
@@ -2119,10 +2191,22 @@
             <w:r>
               <w:rPr>
                 <w:rFonts w:ascii="Arial" w:cs="Arial" w:eastAsia="Microsoft YaHei" w:hAnsi="Arial"/>
+                <w:b/>
+                <w:bCs/>
+                <w:color w:val="E8590C"/>
+                <w:sz w:val="17"/>
+                <w:szCs w:val="17"/>
+              </w:rPr>
+              <w:t xml:space="preserve">【示例】</w:t>
+            </w:r>
+            <w:r>
+              <w:rPr>
+                <w:rFonts w:ascii="Arial" w:cs="Arial" w:eastAsia="Microsoft YaHei" w:hAnsi="Arial"/>
+                <w:color w:val="1D4ED8"/>
                 <w:sz w:val="19"/>
                 <w:szCs w:val="19"/>
               </w:rPr>
-              <w:t xml:space="preserve"/>
+              <w:t xml:space="preserve">Instagram: @infinitesports · Facebook: facebook.com/infinitesports</w:t>
             </w:r>
           </w:p>
         </w:tc>
@@ -2511,7 +2595,7 @@
                 <w:sz w:val="19"/>
                 <w:szCs w:val="19"/>
               </w:rPr>
-              <w:t xml:space="preserve"/>
+              <w:t xml:space="preserve">Programs · Campus · Our team · Gallery · Contact</w:t>
             </w:r>
           </w:p>
         </w:tc>
@@ -2682,7 +2766,7 @@
                 <w:sz w:val="19"/>
                 <w:szCs w:val="19"/>
               </w:rPr>
-              <w:t xml:space="preserve"/>
+              <w:t xml:space="preserve">Enroll ↗</w:t>
             </w:r>
           </w:p>
         </w:tc>
@@ -3071,7 +3155,7 @@
                 <w:sz w:val="19"/>
                 <w:szCs w:val="19"/>
               </w:rPr>
-              <w:t xml:space="preserve"/>
+              <w:t xml:space="preserve">Youth sports academy</w:t>
             </w:r>
           </w:p>
         </w:tc>
@@ -3242,7 +3326,7 @@
                 <w:sz w:val="19"/>
                 <w:szCs w:val="19"/>
               </w:rPr>
-              <w:t xml:space="preserve"/>
+              <w:t xml:space="preserve">Build the athlete within.</w:t>
             </w:r>
           </w:p>
         </w:tc>
@@ -3413,7 +3497,7 @@
                 <w:sz w:val="19"/>
                 <w:szCs w:val="19"/>
               </w:rPr>
-              <w:t xml:space="preserve"/>
+              <w:t xml:space="preserve">Focused coaching. Strong fundamentals. A place where young athletes learn to move, compete, and grow with confidence.</w:t>
             </w:r>
           </w:p>
         </w:tc>
@@ -3584,7 +3668,7 @@
                 <w:sz w:val="19"/>
                 <w:szCs w:val="19"/>
               </w:rPr>
-              <w:t xml:space="preserve"/>
+              <w:t xml:space="preserve">Explore enrollment ↗</w:t>
             </w:r>
           </w:p>
         </w:tc>
@@ -3755,7 +3839,7 @@
                 <w:sz w:val="19"/>
                 <w:szCs w:val="19"/>
               </w:rPr>
-              <w:t xml:space="preserve"/>
+              <w:t xml:space="preserve">View our programs ↓</w:t>
             </w:r>
           </w:p>
         </w:tc>
@@ -3942,7 +4026,7 @@
                 <w:sz w:val="19"/>
                 <w:szCs w:val="19"/>
               </w:rPr>
-              <w:t xml:space="preserve"/>
+              <w:t xml:space="preserve">3  /  Training paths</w:t>
             </w:r>
           </w:p>
         </w:tc>
@@ -4129,7 +4213,7 @@
                 <w:sz w:val="19"/>
                 <w:szCs w:val="19"/>
               </w:rPr>
-              <w:t xml:space="preserve"/>
+              <w:t xml:space="preserve">All  /  Skill levels welcome</w:t>
             </w:r>
           </w:p>
         </w:tc>
@@ -4316,7 +4400,7 @@
                 <w:sz w:val="19"/>
                 <w:szCs w:val="19"/>
               </w:rPr>
-              <w:t xml:space="preserve"/>
+              <w:t xml:space="preserve">Move ✦ Train ✦ Compete ✦ Grow</w:t>
             </w:r>
           </w:p>
         </w:tc>
@@ -4705,7 +4789,7 @@
                 <w:sz w:val="19"/>
                 <w:szCs w:val="19"/>
               </w:rPr>
-              <w:t xml:space="preserve"/>
+              <w:t xml:space="preserve">Find your game</w:t>
             </w:r>
           </w:p>
         </w:tc>
@@ -4876,7 +4960,7 @@
                 <w:sz w:val="19"/>
                 <w:szCs w:val="19"/>
               </w:rPr>
-              <w:t xml:space="preserve"/>
+              <w:t xml:space="preserve">Programs built for progress.</w:t>
             </w:r>
           </w:p>
         </w:tc>
@@ -5047,7 +5131,7 @@
                 <w:sz w:val="19"/>
                 <w:szCs w:val="19"/>
               </w:rPr>
-              <w:t xml:space="preserve"/>
+              <w:t xml:space="preserve">Every class combines clear instruction, high-quality repetitions, and the right amount of challenge for developing athletes.</w:t>
             </w:r>
           </w:p>
         </w:tc>
@@ -5218,7 +5302,7 @@
                 <w:sz w:val="19"/>
                 <w:szCs w:val="19"/>
               </w:rPr>
-              <w:t xml:space="preserve"/>
+              <w:t xml:space="preserve">Ask about this program ↗</w:t>
             </w:r>
           </w:p>
         </w:tc>
@@ -5606,7 +5690,7 @@
                 <w:sz w:val="19"/>
                 <w:szCs w:val="19"/>
               </w:rPr>
-              <w:t xml:space="preserve"/>
+              <w:t xml:space="preserve">Volleyball</w:t>
             </w:r>
           </w:p>
         </w:tc>
@@ -5777,7 +5861,7 @@
                 <w:sz w:val="19"/>
                 <w:szCs w:val="19"/>
               </w:rPr>
-              <w:t xml:space="preserve"/>
+              <w:t xml:space="preserve">Technique + Teamwork</w:t>
             </w:r>
           </w:p>
         </w:tc>
@@ -5948,7 +6032,7 @@
                 <w:sz w:val="19"/>
                 <w:szCs w:val="19"/>
               </w:rPr>
-              <w:t xml:space="preserve"/>
+              <w:t xml:space="preserve">Build confident fundamentals through serving, passing, setting, movement, and game-ready team play.</w:t>
             </w:r>
           </w:p>
         </w:tc>
@@ -6119,7 +6203,7 @@
                 <w:sz w:val="19"/>
                 <w:szCs w:val="19"/>
               </w:rPr>
-              <w:t xml:space="preserve"/>
+              <w:t xml:space="preserve">Ball control · Court movement · Team communication</w:t>
             </w:r>
           </w:p>
         </w:tc>
@@ -6287,10 +6371,22 @@
             <w:r>
               <w:rPr>
                 <w:rFonts w:ascii="Arial" w:cs="Arial" w:eastAsia="Microsoft YaHei" w:hAnsi="Arial"/>
+                <w:b/>
+                <w:bCs/>
+                <w:color w:val="E8590C"/>
+                <w:sz w:val="17"/>
+                <w:szCs w:val="17"/>
+              </w:rPr>
+              <w:t xml:space="preserve">【示例】</w:t>
+            </w:r>
+            <w:r>
+              <w:rPr>
+                <w:rFonts w:ascii="Arial" w:cs="Arial" w:eastAsia="Microsoft YaHei" w:hAnsi="Arial"/>
+                <w:color w:val="1D4ED8"/>
                 <w:sz w:val="19"/>
                 <w:szCs w:val="19"/>
               </w:rPr>
-              <w:t xml:space="preserve"/>
+              <w:t xml:space="preserve">Ages 8–16 · Beginner to advanced</w:t>
             </w:r>
           </w:p>
         </w:tc>
@@ -6458,10 +6554,22 @@
             <w:r>
               <w:rPr>
                 <w:rFonts w:ascii="Arial" w:cs="Arial" w:eastAsia="Microsoft YaHei" w:hAnsi="Arial"/>
+                <w:b/>
+                <w:bCs/>
+                <w:color w:val="E8590C"/>
+                <w:sz w:val="17"/>
+                <w:szCs w:val="17"/>
+              </w:rPr>
+              <w:t xml:space="preserve">【示例】</w:t>
+            </w:r>
+            <w:r>
+              <w:rPr>
+                <w:rFonts w:ascii="Arial" w:cs="Arial" w:eastAsia="Microsoft YaHei" w:hAnsi="Arial"/>
+                <w:color w:val="1D4ED8"/>
                 <w:sz w:val="19"/>
                 <w:szCs w:val="19"/>
               </w:rPr>
-              <w:t xml:space="preserve"/>
+              <w:t xml:space="preserve">Tue &amp; Thu · 5:00–6:30 pm</w:t>
             </w:r>
           </w:p>
         </w:tc>
@@ -6616,7 +6724,7 @@
                 <w:sz w:val="16"/>
                 <w:szCs w:val="16"/>
               </w:rPr>
-              <w:t xml:space="preserve">说明：如不希望公开价格，请留空。</w:t>
+              <w:t xml:space="preserve">说明：如不希望公开价格，请写“删除”。</w:t>
             </w:r>
           </w:p>
         </w:tc>
@@ -6645,10 +6753,22 @@
             <w:r>
               <w:rPr>
                 <w:rFonts w:ascii="Arial" w:cs="Arial" w:eastAsia="Microsoft YaHei" w:hAnsi="Arial"/>
+                <w:b/>
+                <w:bCs/>
+                <w:color w:val="E8590C"/>
+                <w:sz w:val="17"/>
+                <w:szCs w:val="17"/>
+              </w:rPr>
+              <w:t xml:space="preserve">【示例】</w:t>
+            </w:r>
+            <w:r>
+              <w:rPr>
+                <w:rFonts w:ascii="Arial" w:cs="Arial" w:eastAsia="Microsoft YaHei" w:hAnsi="Arial"/>
+                <w:color w:val="1D4ED8"/>
                 <w:sz w:val="19"/>
                 <w:szCs w:val="19"/>
               </w:rPr>
-              <w:t xml:space="preserve"/>
+              <w:t xml:space="preserve">$___ / month（8 classes）</w:t>
             </w:r>
           </w:p>
         </w:tc>
@@ -7041,7 +7161,7 @@
                 <w:sz w:val="19"/>
                 <w:szCs w:val="19"/>
               </w:rPr>
-              <w:t xml:space="preserve"/>
+              <w:t xml:space="preserve">Basketball</w:t>
             </w:r>
           </w:p>
         </w:tc>
@@ -7212,7 +7332,7 @@
                 <w:sz w:val="19"/>
                 <w:szCs w:val="19"/>
               </w:rPr>
-              <w:t xml:space="preserve"/>
+              <w:t xml:space="preserve">Skill + Game IQ</w:t>
             </w:r>
           </w:p>
         </w:tc>
@@ -7383,7 +7503,7 @@
                 <w:sz w:val="19"/>
                 <w:szCs w:val="19"/>
               </w:rPr>
-              <w:t xml:space="preserve"/>
+              <w:t xml:space="preserve">Develop strong habits on both ends of the court with purposeful reps, smart decisions, and competitive play.</w:t>
             </w:r>
           </w:p>
         </w:tc>
@@ -7554,7 +7674,7 @@
                 <w:sz w:val="19"/>
                 <w:szCs w:val="19"/>
               </w:rPr>
-              <w:t xml:space="preserve"/>
+              <w:t xml:space="preserve">Handle &amp; footwork · Finishing · Defense &amp; spacing</w:t>
             </w:r>
           </w:p>
         </w:tc>
@@ -7722,10 +7842,22 @@
             <w:r>
               <w:rPr>
                 <w:rFonts w:ascii="Arial" w:cs="Arial" w:eastAsia="Microsoft YaHei" w:hAnsi="Arial"/>
+                <w:b/>
+                <w:bCs/>
+                <w:color w:val="E8590C"/>
+                <w:sz w:val="17"/>
+                <w:szCs w:val="17"/>
+              </w:rPr>
+              <w:t xml:space="preserve">【示例】</w:t>
+            </w:r>
+            <w:r>
+              <w:rPr>
+                <w:rFonts w:ascii="Arial" w:cs="Arial" w:eastAsia="Microsoft YaHei" w:hAnsi="Arial"/>
+                <w:color w:val="1D4ED8"/>
                 <w:sz w:val="19"/>
                 <w:szCs w:val="19"/>
               </w:rPr>
-              <w:t xml:space="preserve"/>
+              <w:t xml:space="preserve">Ages 7–16 · Beginner to advanced</w:t>
             </w:r>
           </w:p>
         </w:tc>
@@ -7893,10 +8025,22 @@
             <w:r>
               <w:rPr>
                 <w:rFonts w:ascii="Arial" w:cs="Arial" w:eastAsia="Microsoft YaHei" w:hAnsi="Arial"/>
+                <w:b/>
+                <w:bCs/>
+                <w:color w:val="E8590C"/>
+                <w:sz w:val="17"/>
+                <w:szCs w:val="17"/>
+              </w:rPr>
+              <w:t xml:space="preserve">【示例】</w:t>
+            </w:r>
+            <w:r>
+              <w:rPr>
+                <w:rFonts w:ascii="Arial" w:cs="Arial" w:eastAsia="Microsoft YaHei" w:hAnsi="Arial"/>
+                <w:color w:val="1D4ED8"/>
                 <w:sz w:val="19"/>
                 <w:szCs w:val="19"/>
               </w:rPr>
-              <w:t xml:space="preserve"/>
+              <w:t xml:space="preserve">Tue &amp; Thu · 5:00–6:30 pm</w:t>
             </w:r>
           </w:p>
         </w:tc>
@@ -8051,7 +8195,7 @@
                 <w:sz w:val="16"/>
                 <w:szCs w:val="16"/>
               </w:rPr>
-              <w:t xml:space="preserve">说明：如不希望公开价格，请留空。</w:t>
+              <w:t xml:space="preserve">说明：如不希望公开价格，请写“删除”。</w:t>
             </w:r>
           </w:p>
         </w:tc>
@@ -8080,10 +8224,22 @@
             <w:r>
               <w:rPr>
                 <w:rFonts w:ascii="Arial" w:cs="Arial" w:eastAsia="Microsoft YaHei" w:hAnsi="Arial"/>
+                <w:b/>
+                <w:bCs/>
+                <w:color w:val="E8590C"/>
+                <w:sz w:val="17"/>
+                <w:szCs w:val="17"/>
+              </w:rPr>
+              <w:t xml:space="preserve">【示例】</w:t>
+            </w:r>
+            <w:r>
+              <w:rPr>
+                <w:rFonts w:ascii="Arial" w:cs="Arial" w:eastAsia="Microsoft YaHei" w:hAnsi="Arial"/>
+                <w:color w:val="1D4ED8"/>
                 <w:sz w:val="19"/>
                 <w:szCs w:val="19"/>
               </w:rPr>
-              <w:t xml:space="preserve"/>
+              <w:t xml:space="preserve">$___ / month（8 classes）</w:t>
             </w:r>
           </w:p>
         </w:tc>
@@ -8476,7 +8632,7 @@
                 <w:sz w:val="19"/>
                 <w:szCs w:val="19"/>
               </w:rPr>
-              <w:t xml:space="preserve"/>
+              <w:t xml:space="preserve">Core Training</w:t>
             </w:r>
           </w:p>
         </w:tc>
@@ -8647,7 +8803,7 @@
                 <w:sz w:val="19"/>
                 <w:szCs w:val="19"/>
               </w:rPr>
-              <w:t xml:space="preserve"/>
+              <w:t xml:space="preserve">Strength + Movement</w:t>
             </w:r>
           </w:p>
         </w:tc>
@@ -8818,7 +8974,7 @@
                 <w:sz w:val="19"/>
                 <w:szCs w:val="19"/>
               </w:rPr>
-              <w:t xml:space="preserve"/>
+              <w:t xml:space="preserve">Create the athletic foundation every young player needs: balance, coordination, stability, and speed.</w:t>
             </w:r>
           </w:p>
         </w:tc>
@@ -8989,7 +9145,7 @@
                 <w:sz w:val="19"/>
                 <w:szCs w:val="19"/>
               </w:rPr>
-              <w:t xml:space="preserve"/>
+              <w:t xml:space="preserve">Body control · Agility · Injury resilience</w:t>
             </w:r>
           </w:p>
         </w:tc>
@@ -9157,10 +9313,22 @@
             <w:r>
               <w:rPr>
                 <w:rFonts w:ascii="Arial" w:cs="Arial" w:eastAsia="Microsoft YaHei" w:hAnsi="Arial"/>
+                <w:b/>
+                <w:bCs/>
+                <w:color w:val="E8590C"/>
+                <w:sz w:val="17"/>
+                <w:szCs w:val="17"/>
+              </w:rPr>
+              <w:t xml:space="preserve">【示例】</w:t>
+            </w:r>
+            <w:r>
+              <w:rPr>
+                <w:rFonts w:ascii="Arial" w:cs="Arial" w:eastAsia="Microsoft YaHei" w:hAnsi="Arial"/>
+                <w:color w:val="1D4ED8"/>
                 <w:sz w:val="19"/>
                 <w:szCs w:val="19"/>
               </w:rPr>
-              <w:t xml:space="preserve"/>
+              <w:t xml:space="preserve">Ages 6–16 · All levels</w:t>
             </w:r>
           </w:p>
         </w:tc>
@@ -9328,10 +9496,22 @@
             <w:r>
               <w:rPr>
                 <w:rFonts w:ascii="Arial" w:cs="Arial" w:eastAsia="Microsoft YaHei" w:hAnsi="Arial"/>
+                <w:b/>
+                <w:bCs/>
+                <w:color w:val="E8590C"/>
+                <w:sz w:val="17"/>
+                <w:szCs w:val="17"/>
+              </w:rPr>
+              <w:t xml:space="preserve">【示例】</w:t>
+            </w:r>
+            <w:r>
+              <w:rPr>
+                <w:rFonts w:ascii="Arial" w:cs="Arial" w:eastAsia="Microsoft YaHei" w:hAnsi="Arial"/>
+                <w:color w:val="1D4ED8"/>
                 <w:sz w:val="19"/>
                 <w:szCs w:val="19"/>
               </w:rPr>
-              <w:t xml:space="preserve"/>
+              <w:t xml:space="preserve">Tue &amp; Thu · 5:00–6:30 pm</w:t>
             </w:r>
           </w:p>
         </w:tc>
@@ -9486,7 +9666,7 @@
                 <w:sz w:val="16"/>
                 <w:szCs w:val="16"/>
               </w:rPr>
-              <w:t xml:space="preserve">说明：如不希望公开价格，请留空。</w:t>
+              <w:t xml:space="preserve">说明：如不希望公开价格，请写“删除”。</w:t>
             </w:r>
           </w:p>
         </w:tc>
@@ -9515,10 +9695,22 @@
             <w:r>
               <w:rPr>
                 <w:rFonts w:ascii="Arial" w:cs="Arial" w:eastAsia="Microsoft YaHei" w:hAnsi="Arial"/>
+                <w:b/>
+                <w:bCs/>
+                <w:color w:val="E8590C"/>
+                <w:sz w:val="17"/>
+                <w:szCs w:val="17"/>
+              </w:rPr>
+              <w:t xml:space="preserve">【示例】</w:t>
+            </w:r>
+            <w:r>
+              <w:rPr>
+                <w:rFonts w:ascii="Arial" w:cs="Arial" w:eastAsia="Microsoft YaHei" w:hAnsi="Arial"/>
+                <w:color w:val="1D4ED8"/>
                 <w:sz w:val="19"/>
                 <w:szCs w:val="19"/>
               </w:rPr>
-              <w:t xml:space="preserve"/>
+              <w:t xml:space="preserve">$___ / month（8 classes）</w:t>
             </w:r>
           </w:p>
         </w:tc>
@@ -9981,7 +10173,7 @@
                 <w:sz w:val="19"/>
                 <w:szCs w:val="19"/>
               </w:rPr>
-              <w:t xml:space="preserve"/>
+              <w:t xml:space="preserve">Our campus</w:t>
             </w:r>
           </w:p>
         </w:tc>
@@ -10152,7 +10344,7 @@
                 <w:sz w:val="19"/>
                 <w:szCs w:val="19"/>
               </w:rPr>
-              <w:t xml:space="preserve"/>
+              <w:t xml:space="preserve">Your home court for what comes next.</w:t>
             </w:r>
           </w:p>
         </w:tc>
@@ -10339,7 +10531,7 @@
                 <w:sz w:val="19"/>
                 <w:szCs w:val="19"/>
               </w:rPr>
-              <w:t xml:space="preserve"/>
+              <w:t xml:space="preserve">A welcoming training environment with room to learn, move, and get better—one purposeful session at a time.</w:t>
             </w:r>
           </w:p>
         </w:tc>
@@ -10523,10 +10715,22 @@
             <w:r>
               <w:rPr>
                 <w:rFonts w:ascii="Arial" w:cs="Arial" w:eastAsia="Microsoft YaHei" w:hAnsi="Arial"/>
+                <w:b/>
+                <w:bCs/>
+                <w:color w:val="E8590C"/>
+                <w:sz w:val="17"/>
+                <w:szCs w:val="17"/>
+              </w:rPr>
+              <w:t xml:space="preserve">【请填写】</w:t>
+            </w:r>
+            <w:r>
+              <w:rPr>
+                <w:rFonts w:ascii="Arial" w:cs="Arial" w:eastAsia="Microsoft YaHei" w:hAnsi="Arial"/>
+                <w:color w:val="1D4ED8"/>
                 <w:sz w:val="19"/>
                 <w:szCs w:val="19"/>
               </w:rPr>
-              <w:t xml:space="preserve"/>
+              <w:t xml:space="preserve">Street address, City, State ZIP</w:t>
             </w:r>
           </w:p>
         </w:tc>
@@ -10710,10 +10914,22 @@
             <w:r>
               <w:rPr>
                 <w:rFonts w:ascii="Arial" w:cs="Arial" w:eastAsia="Microsoft YaHei" w:hAnsi="Arial"/>
+                <w:b/>
+                <w:bCs/>
+                <w:color w:val="E8590C"/>
+                <w:sz w:val="17"/>
+                <w:szCs w:val="17"/>
+              </w:rPr>
+              <w:t xml:space="preserve">【示例】</w:t>
+            </w:r>
+            <w:r>
+              <w:rPr>
+                <w:rFonts w:ascii="Arial" w:cs="Arial" w:eastAsia="Microsoft YaHei" w:hAnsi="Arial"/>
+                <w:color w:val="1D4ED8"/>
                 <w:sz w:val="19"/>
                 <w:szCs w:val="19"/>
               </w:rPr>
-              <w:t xml:space="preserve"/>
+              <w:t xml:space="preserve">Mon–Fri 4–8 pm · Sat 9 am–3 pm</w:t>
             </w:r>
           </w:p>
         </w:tc>
@@ -10884,7 +11100,7 @@
                 <w:sz w:val="19"/>
                 <w:szCs w:val="19"/>
               </w:rPr>
-              <w:t xml:space="preserve"/>
+              <w:t xml:space="preserve">Plan your first visit ↗</w:t>
             </w:r>
           </w:p>
         </w:tc>
@@ -11273,7 +11489,7 @@
                 <w:sz w:val="19"/>
                 <w:szCs w:val="19"/>
               </w:rPr>
-              <w:t xml:space="preserve"/>
+              <w:t xml:space="preserve">The coaching team</w:t>
             </w:r>
           </w:p>
         </w:tc>
@@ -11444,7 +11660,7 @@
                 <w:sz w:val="19"/>
                 <w:szCs w:val="19"/>
               </w:rPr>
-              <w:t xml:space="preserve"/>
+              <w:t xml:space="preserve">Great coaches shape more than skills.</w:t>
             </w:r>
           </w:p>
         </w:tc>
@@ -11615,7 +11831,7 @@
                 <w:sz w:val="19"/>
                 <w:szCs w:val="19"/>
               </w:rPr>
-              <w:t xml:space="preserve"/>
+              <w:t xml:space="preserve">Our coaching approach is positive, detail-driven, and built around the long-term development of every athlete.</w:t>
             </w:r>
           </w:p>
         </w:tc>
@@ -12005,10 +12221,22 @@
             <w:r>
               <w:rPr>
                 <w:rFonts w:ascii="Arial" w:cs="Arial" w:eastAsia="Microsoft YaHei" w:hAnsi="Arial"/>
+                <w:b/>
+                <w:bCs/>
+                <w:color w:val="E8590C"/>
+                <w:sz w:val="17"/>
+                <w:szCs w:val="17"/>
+              </w:rPr>
+              <w:t xml:space="preserve">【请填写】</w:t>
+            </w:r>
+            <w:r>
+              <w:rPr>
+                <w:rFonts w:ascii="Arial" w:cs="Arial" w:eastAsia="Microsoft YaHei" w:hAnsi="Arial"/>
+                <w:color w:val="1D4ED8"/>
                 <w:sz w:val="19"/>
                 <w:szCs w:val="19"/>
               </w:rPr>
-              <w:t xml:space="preserve"/>
+              <w:t xml:space="preserve">First Last</w:t>
             </w:r>
           </w:p>
         </w:tc>
@@ -12179,7 +12407,7 @@
                 <w:sz w:val="19"/>
                 <w:szCs w:val="19"/>
               </w:rPr>
-              <w:t xml:space="preserve"/>
+              <w:t xml:space="preserve">Head Coach</w:t>
             </w:r>
           </w:p>
         </w:tc>
@@ -12350,7 +12578,7 @@
                 <w:sz w:val="19"/>
                 <w:szCs w:val="19"/>
               </w:rPr>
-              <w:t xml:space="preserve"/>
+              <w:t xml:space="preserve">Program leadership &amp; athlete development</w:t>
             </w:r>
           </w:p>
         </w:tc>
@@ -12534,10 +12762,22 @@
             <w:r>
               <w:rPr>
                 <w:rFonts w:ascii="Arial" w:cs="Arial" w:eastAsia="Microsoft YaHei" w:hAnsi="Arial"/>
+                <w:b/>
+                <w:bCs/>
+                <w:color w:val="E8590C"/>
+                <w:sz w:val="17"/>
+                <w:szCs w:val="17"/>
+              </w:rPr>
+              <w:t xml:space="preserve">【示例】</w:t>
+            </w:r>
+            <w:r>
+              <w:rPr>
+                <w:rFonts w:ascii="Arial" w:cs="Arial" w:eastAsia="Microsoft YaHei" w:hAnsi="Arial"/>
+                <w:color w:val="1D4ED8"/>
                 <w:sz w:val="19"/>
                 <w:szCs w:val="19"/>
               </w:rPr>
-              <w:t xml:space="preserve"/>
+              <w:t xml:space="preserve">Coach ___ founded Infinite Sports after __ years of coaching youth athletes. A former ___ player, they focus on building confident, well-rounded athletes.</w:t>
             </w:r>
           </w:p>
         </w:tc>
@@ -12927,10 +13167,22 @@
             <w:r>
               <w:rPr>
                 <w:rFonts w:ascii="Arial" w:cs="Arial" w:eastAsia="Microsoft YaHei" w:hAnsi="Arial"/>
+                <w:b/>
+                <w:bCs/>
+                <w:color w:val="E8590C"/>
+                <w:sz w:val="17"/>
+                <w:szCs w:val="17"/>
+              </w:rPr>
+              <w:t xml:space="preserve">【请填写】</w:t>
+            </w:r>
+            <w:r>
+              <w:rPr>
+                <w:rFonts w:ascii="Arial" w:cs="Arial" w:eastAsia="Microsoft YaHei" w:hAnsi="Arial"/>
+                <w:color w:val="1D4ED8"/>
                 <w:sz w:val="19"/>
                 <w:szCs w:val="19"/>
               </w:rPr>
-              <w:t xml:space="preserve"/>
+              <w:t xml:space="preserve">First Last</w:t>
             </w:r>
           </w:p>
         </w:tc>
@@ -13101,7 +13353,7 @@
                 <w:sz w:val="19"/>
                 <w:szCs w:val="19"/>
               </w:rPr>
-              <w:t xml:space="preserve"/>
+              <w:t xml:space="preserve">Volleyball Coach</w:t>
             </w:r>
           </w:p>
         </w:tc>
@@ -13272,7 +13524,7 @@
                 <w:sz w:val="19"/>
                 <w:szCs w:val="19"/>
               </w:rPr>
-              <w:t xml:space="preserve"/>
+              <w:t xml:space="preserve">Fundamentals, movement &amp; team play</w:t>
             </w:r>
           </w:p>
         </w:tc>
@@ -13456,10 +13708,22 @@
             <w:r>
               <w:rPr>
                 <w:rFonts w:ascii="Arial" w:cs="Arial" w:eastAsia="Microsoft YaHei" w:hAnsi="Arial"/>
+                <w:b/>
+                <w:bCs/>
+                <w:color w:val="E8590C"/>
+                <w:sz w:val="17"/>
+                <w:szCs w:val="17"/>
+              </w:rPr>
+              <w:t xml:space="preserve">【示例】</w:t>
+            </w:r>
+            <w:r>
+              <w:rPr>
+                <w:rFonts w:ascii="Arial" w:cs="Arial" w:eastAsia="Microsoft YaHei" w:hAnsi="Arial"/>
+                <w:color w:val="1D4ED8"/>
                 <w:sz w:val="19"/>
                 <w:szCs w:val="19"/>
               </w:rPr>
-              <w:t xml:space="preserve"/>
+              <w:t xml:space="preserve">Coach ___ played collegiate volleyball at ___ and has coached club teams for __ years. Certified by ___.</w:t>
             </w:r>
           </w:p>
         </w:tc>
@@ -13849,10 +14113,22 @@
             <w:r>
               <w:rPr>
                 <w:rFonts w:ascii="Arial" w:cs="Arial" w:eastAsia="Microsoft YaHei" w:hAnsi="Arial"/>
+                <w:b/>
+                <w:bCs/>
+                <w:color w:val="E8590C"/>
+                <w:sz w:val="17"/>
+                <w:szCs w:val="17"/>
+              </w:rPr>
+              <w:t xml:space="preserve">【请填写】</w:t>
+            </w:r>
+            <w:r>
+              <w:rPr>
+                <w:rFonts w:ascii="Arial" w:cs="Arial" w:eastAsia="Microsoft YaHei" w:hAnsi="Arial"/>
+                <w:color w:val="1D4ED8"/>
                 <w:sz w:val="19"/>
                 <w:szCs w:val="19"/>
               </w:rPr>
-              <w:t xml:space="preserve"/>
+              <w:t xml:space="preserve">First Last</w:t>
             </w:r>
           </w:p>
         </w:tc>
@@ -14023,7 +14299,7 @@
                 <w:sz w:val="19"/>
                 <w:szCs w:val="19"/>
               </w:rPr>
-              <w:t xml:space="preserve"/>
+              <w:t xml:space="preserve">Basketball Coach</w:t>
             </w:r>
           </w:p>
         </w:tc>
@@ -14194,7 +14470,7 @@
                 <w:sz w:val="19"/>
                 <w:szCs w:val="19"/>
               </w:rPr>
-              <w:t xml:space="preserve"/>
+              <w:t xml:space="preserve">Skill development &amp; game decisions</w:t>
             </w:r>
           </w:p>
         </w:tc>
@@ -14378,10 +14654,22 @@
             <w:r>
               <w:rPr>
                 <w:rFonts w:ascii="Arial" w:cs="Arial" w:eastAsia="Microsoft YaHei" w:hAnsi="Arial"/>
+                <w:b/>
+                <w:bCs/>
+                <w:color w:val="E8590C"/>
+                <w:sz w:val="17"/>
+                <w:szCs w:val="17"/>
+              </w:rPr>
+              <w:t xml:space="preserve">【示例】</w:t>
+            </w:r>
+            <w:r>
+              <w:rPr>
+                <w:rFonts w:ascii="Arial" w:cs="Arial" w:eastAsia="Microsoft YaHei" w:hAnsi="Arial"/>
+                <w:color w:val="1D4ED8"/>
                 <w:sz w:val="19"/>
                 <w:szCs w:val="19"/>
               </w:rPr>
-              <w:t xml:space="preserve"/>
+              <w:t xml:space="preserve">Coach ___ has __ years of experience developing young players, with a focus on fundamentals, footwork, and smart decision-making.</w:t>
             </w:r>
           </w:p>
         </w:tc>
@@ -14844,7 +15132,7 @@
                 <w:sz w:val="19"/>
                 <w:szCs w:val="19"/>
               </w:rPr>
-              <w:t xml:space="preserve"/>
+              <w:t xml:space="preserve">Inside the work</w:t>
             </w:r>
           </w:p>
         </w:tc>
@@ -15015,7 +15303,7 @@
                 <w:sz w:val="19"/>
                 <w:szCs w:val="19"/>
               </w:rPr>
-              <w:t xml:space="preserve"/>
+              <w:t xml:space="preserve">Energy you can feel.</w:t>
             </w:r>
           </w:p>
         </w:tc>
@@ -15186,7 +15474,7 @@
                 <w:sz w:val="19"/>
                 <w:szCs w:val="19"/>
               </w:rPr>
-              <w:t xml:space="preserve"/>
+              <w:t xml:space="preserve">Real focus. Real reps. Real confidence taking shape.</w:t>
             </w:r>
           </w:p>
         </w:tc>
@@ -15373,7 +15661,7 @@
                 <w:sz w:val="19"/>
                 <w:szCs w:val="19"/>
               </w:rPr>
-              <w:t xml:space="preserve"/>
+              <w:t xml:space="preserve">Teamwork in motion</w:t>
             </w:r>
           </w:p>
         </w:tc>
@@ -15560,7 +15848,7 @@
                 <w:sz w:val="19"/>
                 <w:szCs w:val="19"/>
               </w:rPr>
-              <w:t xml:space="preserve"/>
+              <w:t xml:space="preserve">Ready for the next rep</w:t>
             </w:r>
           </w:p>
         </w:tc>
@@ -15747,7 +16035,7 @@
                 <w:sz w:val="19"/>
                 <w:szCs w:val="19"/>
               </w:rPr>
-              <w:t xml:space="preserve"/>
+              <w:t xml:space="preserve">Coaching that connects</w:t>
             </w:r>
           </w:p>
         </w:tc>
@@ -15934,7 +16222,7 @@
                 <w:sz w:val="19"/>
                 <w:szCs w:val="19"/>
               </w:rPr>
-              <w:t xml:space="preserve"/>
+              <w:t xml:space="preserve">Strong habits today. Limitless potential tomorrow.</w:t>
             </w:r>
           </w:p>
         </w:tc>
@@ -17786,7 +18074,7 @@
                 <w:sz w:val="19"/>
                 <w:szCs w:val="19"/>
               </w:rPr>
-              <w:t xml:space="preserve"/>
+              <w:t xml:space="preserve">Train with purpose. Grow without limits.</w:t>
             </w:r>
           </w:p>
         </w:tc>
@@ -17973,7 +18261,7 @@
                 <w:sz w:val="19"/>
                 <w:szCs w:val="19"/>
               </w:rPr>
-              <w:t xml:space="preserve"/>
+              <w:t xml:space="preserve">© 2026 Infinite Sports. Photos: cottonbro studio / Pexels, Vince Fleming &amp; Lesli Whitecotton / Unsplash.</w:t>
             </w:r>
           </w:p>
         </w:tc>
@@ -18569,10 +18857,22 @@
             <w:r>
               <w:rPr>
                 <w:rFonts w:ascii="Arial" w:cs="Arial" w:eastAsia="Microsoft YaHei" w:hAnsi="Arial"/>
+                <w:b/>
+                <w:bCs/>
+                <w:color w:val="E8590C"/>
+                <w:sz w:val="17"/>
+                <w:szCs w:val="17"/>
+              </w:rPr>
+              <w:t xml:space="preserve">【建议】</w:t>
+            </w:r>
+            <w:r>
+              <w:rPr>
+                <w:rFonts w:ascii="Arial" w:cs="Arial" w:eastAsia="Microsoft YaHei" w:hAnsi="Arial"/>
+                <w:color w:val="1D4ED8"/>
                 <w:sz w:val="19"/>
                 <w:szCs w:val="19"/>
               </w:rPr>
-              <w:t xml:space="preserve"/>
+              <w:t xml:space="preserve">IMG-01-hero.jpg</w:t>
             </w:r>
           </w:p>
           <w:p>
@@ -18895,10 +19195,22 @@
             <w:r>
               <w:rPr>
                 <w:rFonts w:ascii="Arial" w:cs="Arial" w:eastAsia="Microsoft YaHei" w:hAnsi="Arial"/>
+                <w:b/>
+                <w:bCs/>
+                <w:color w:val="E8590C"/>
+                <w:sz w:val="17"/>
+                <w:szCs w:val="17"/>
+              </w:rPr>
+              <w:t xml:space="preserve">【建议】</w:t>
+            </w:r>
+            <w:r>
+              <w:rPr>
+                <w:rFonts w:ascii="Arial" w:cs="Arial" w:eastAsia="Microsoft YaHei" w:hAnsi="Arial"/>
+                <w:color w:val="1D4ED8"/>
                 <w:sz w:val="19"/>
                 <w:szCs w:val="19"/>
               </w:rPr>
-              <w:t xml:space="preserve"/>
+              <w:t xml:space="preserve">IMG-02-volleyball.jpg</w:t>
             </w:r>
           </w:p>
           <w:p>
@@ -19221,10 +19533,22 @@
             <w:r>
               <w:rPr>
                 <w:rFonts w:ascii="Arial" w:cs="Arial" w:eastAsia="Microsoft YaHei" w:hAnsi="Arial"/>
+                <w:b/>
+                <w:bCs/>
+                <w:color w:val="E8590C"/>
+                <w:sz w:val="17"/>
+                <w:szCs w:val="17"/>
+              </w:rPr>
+              <w:t xml:space="preserve">【建议】</w:t>
+            </w:r>
+            <w:r>
+              <w:rPr>
+                <w:rFonts w:ascii="Arial" w:cs="Arial" w:eastAsia="Microsoft YaHei" w:hAnsi="Arial"/>
+                <w:color w:val="1D4ED8"/>
                 <w:sz w:val="19"/>
                 <w:szCs w:val="19"/>
               </w:rPr>
-              <w:t xml:space="preserve"/>
+              <w:t xml:space="preserve">IMG-03-basketball.jpg</w:t>
             </w:r>
           </w:p>
           <w:p>
@@ -19547,10 +19871,22 @@
             <w:r>
               <w:rPr>
                 <w:rFonts w:ascii="Arial" w:cs="Arial" w:eastAsia="Microsoft YaHei" w:hAnsi="Arial"/>
+                <w:b/>
+                <w:bCs/>
+                <w:color w:val="E8590C"/>
+                <w:sz w:val="17"/>
+                <w:szCs w:val="17"/>
+              </w:rPr>
+              <w:t xml:space="preserve">【建议】</w:t>
+            </w:r>
+            <w:r>
+              <w:rPr>
+                <w:rFonts w:ascii="Arial" w:cs="Arial" w:eastAsia="Microsoft YaHei" w:hAnsi="Arial"/>
+                <w:color w:val="1D4ED8"/>
                 <w:sz w:val="19"/>
                 <w:szCs w:val="19"/>
               </w:rPr>
-              <w:t xml:space="preserve"/>
+              <w:t xml:space="preserve">IMG-04-share.jpg（可由我们制作）</w:t>
             </w:r>
           </w:p>
           <w:p>
@@ -20097,10 +20433,22 @@
             <w:r>
               <w:rPr>
                 <w:rFonts w:ascii="Arial" w:cs="Arial" w:eastAsia="Microsoft YaHei" w:hAnsi="Arial"/>
+                <w:b/>
+                <w:bCs/>
+                <w:color w:val="E8590C"/>
+                <w:sz w:val="17"/>
+                <w:szCs w:val="17"/>
+              </w:rPr>
+              <w:t xml:space="preserve">【建议】</w:t>
+            </w:r>
+            <w:r>
+              <w:rPr>
+                <w:rFonts w:ascii="Arial" w:cs="Arial" w:eastAsia="Microsoft YaHei" w:hAnsi="Arial"/>
+                <w:color w:val="1D4ED8"/>
                 <w:sz w:val="19"/>
                 <w:szCs w:val="19"/>
               </w:rPr>
-              <w:t xml:space="preserve"/>
+              <w:t xml:space="preserve">IMG-05-coach1.jpg</w:t>
             </w:r>
           </w:p>
           <w:p>
@@ -20367,10 +20715,22 @@
             <w:r>
               <w:rPr>
                 <w:rFonts w:ascii="Arial" w:cs="Arial" w:eastAsia="Microsoft YaHei" w:hAnsi="Arial"/>
+                <w:b/>
+                <w:bCs/>
+                <w:color w:val="E8590C"/>
+                <w:sz w:val="17"/>
+                <w:szCs w:val="17"/>
+              </w:rPr>
+              <w:t xml:space="preserve">【建议】</w:t>
+            </w:r>
+            <w:r>
+              <w:rPr>
+                <w:rFonts w:ascii="Arial" w:cs="Arial" w:eastAsia="Microsoft YaHei" w:hAnsi="Arial"/>
+                <w:color w:val="1D4ED8"/>
                 <w:sz w:val="19"/>
                 <w:szCs w:val="19"/>
               </w:rPr>
-              <w:t xml:space="preserve"/>
+              <w:t xml:space="preserve">IMG-06-coach2.jpg</w:t>
             </w:r>
           </w:p>
           <w:p>
@@ -20637,10 +20997,22 @@
             <w:r>
               <w:rPr>
                 <w:rFonts w:ascii="Arial" w:cs="Arial" w:eastAsia="Microsoft YaHei" w:hAnsi="Arial"/>
+                <w:b/>
+                <w:bCs/>
+                <w:color w:val="E8590C"/>
+                <w:sz w:val="17"/>
+                <w:szCs w:val="17"/>
+              </w:rPr>
+              <w:t xml:space="preserve">【建议】</w:t>
+            </w:r>
+            <w:r>
+              <w:rPr>
+                <w:rFonts w:ascii="Arial" w:cs="Arial" w:eastAsia="Microsoft YaHei" w:hAnsi="Arial"/>
+                <w:color w:val="1D4ED8"/>
                 <w:sz w:val="19"/>
                 <w:szCs w:val="19"/>
               </w:rPr>
-              <w:t xml:space="preserve"/>
+              <w:t xml:space="preserve">IMG-07-coach3.jpg</w:t>
             </w:r>
           </w:p>
           <w:p>
@@ -20933,10 +21305,22 @@
             <w:r>
               <w:rPr>
                 <w:rFonts w:ascii="Arial" w:cs="Arial" w:eastAsia="Microsoft YaHei" w:hAnsi="Arial"/>
+                <w:b/>
+                <w:bCs/>
+                <w:color w:val="E8590C"/>
+                <w:sz w:val="17"/>
+                <w:szCs w:val="17"/>
+              </w:rPr>
+              <w:t xml:space="preserve">【建议】</w:t>
+            </w:r>
+            <w:r>
+              <w:rPr>
+                <w:rFonts w:ascii="Arial" w:cs="Arial" w:eastAsia="Microsoft YaHei" w:hAnsi="Arial"/>
+                <w:color w:val="1D4ED8"/>
                 <w:sz w:val="19"/>
                 <w:szCs w:val="19"/>
               </w:rPr>
-              <w:t xml:space="preserve"/>
+              <w:t xml:space="preserve">IMG-08-logo.svg</w:t>
             </w:r>
           </w:p>
           <w:p>
@@ -21216,10 +21600,22 @@
             <w:r>
               <w:rPr>
                 <w:rFonts w:ascii="Arial" w:cs="Arial" w:eastAsia="Microsoft YaHei" w:hAnsi="Arial"/>
+                <w:b/>
+                <w:bCs/>
+                <w:color w:val="E8590C"/>
+                <w:sz w:val="17"/>
+                <w:szCs w:val="17"/>
+              </w:rPr>
+              <w:t xml:space="preserve">【建议】</w:t>
+            </w:r>
+            <w:r>
+              <w:rPr>
+                <w:rFonts w:ascii="Arial" w:cs="Arial" w:eastAsia="Microsoft YaHei" w:hAnsi="Arial"/>
+                <w:color w:val="1D4ED8"/>
                 <w:sz w:val="19"/>
                 <w:szCs w:val="19"/>
               </w:rPr>
-              <w:t xml:space="preserve"/>
+              <w:t xml:space="preserve">IMG-09-campus.jpg</w:t>
             </w:r>
           </w:p>
           <w:p>
@@ -21512,10 +21908,22 @@
             <w:r>
               <w:rPr>
                 <w:rFonts w:ascii="Arial" w:cs="Arial" w:eastAsia="Microsoft YaHei" w:hAnsi="Arial"/>
+                <w:b/>
+                <w:bCs/>
+                <w:color w:val="E8590C"/>
+                <w:sz w:val="17"/>
+                <w:szCs w:val="17"/>
+              </w:rPr>
+              <w:t xml:space="preserve">【建议】</w:t>
+            </w:r>
+            <w:r>
+              <w:rPr>
+                <w:rFonts w:ascii="Arial" w:cs="Arial" w:eastAsia="Microsoft YaHei" w:hAnsi="Arial"/>
+                <w:color w:val="1D4ED8"/>
                 <w:sz w:val="19"/>
                 <w:szCs w:val="19"/>
               </w:rPr>
-              <w:t xml:space="preserve"/>
+              <w:t xml:space="preserve">IMG-10a.jpg, IMG-10b.jpg …</w:t>
             </w:r>
           </w:p>
           <w:p>

</xml_diff>

<commit_message>
Fill enrollment form link in content checklist
Co-Authored-By: Claude Opus 5.5 <noreply@anthropic.com>
Claude-Session: https://claude.ai/code/session_01MP287J4ytmKJQmpMcNBeyF
</commit_message>
<xml_diff>
--- a/docs/Infinite-Sports-网站内容收集清单.docx
+++ b/docs/Infinite-Sports-网站内容收集清单.docx
@@ -417,7 +417,7 @@
                 <w:sz w:val="19"/>
                 <w:szCs w:val="19"/>
               </w:rPr>
-              <w:t xml:space="preserve">v2（已预填）· 2026-10-01</w:t>
+              <w:t xml:space="preserve">v3（已预填，含报名链接）· 2026-10-01</w:t>
             </w:r>
           </w:p>
         </w:tc>
@@ -1235,7 +1235,7 @@
                 <w:sz w:val="16"/>
                 <w:szCs w:val="16"/>
               </w:rPr>
-              <w:t xml:space="preserve">说明：请提供报名表/预约网址（如 Google Form、Jotform、官网系统），全站所有报名按钮都会指向它。</w:t>
+              <w:t xml:space="preserve">说明：已创建 Google Form 报名表，全站所有报名按钮都会指向它。如需更换请直接修改。</w:t>
             </w:r>
           </w:p>
         </w:tc>
@@ -1264,22 +1264,10 @@
             <w:r>
               <w:rPr>
                 <w:rFonts w:ascii="Arial" w:cs="Arial" w:eastAsia="Microsoft YaHei" w:hAnsi="Arial"/>
-                <w:b/>
-                <w:bCs/>
-                <w:color w:val="E8590C"/>
-                <w:sz w:val="17"/>
-                <w:szCs w:val="17"/>
-              </w:rPr>
-              <w:t xml:space="preserve">【请填写】</w:t>
-            </w:r>
-            <w:r>
-              <w:rPr>
-                <w:rFonts w:ascii="Arial" w:cs="Arial" w:eastAsia="Microsoft YaHei" w:hAnsi="Arial"/>
-                <w:color w:val="1D4ED8"/>
                 <w:sz w:val="19"/>
                 <w:szCs w:val="19"/>
               </w:rPr>
-              <w:t xml:space="preserve">https://（报名表网址）</w:t>
+              <w:t xml:space="preserve">https://docs.google.com/forms/d/e/1FAIpQLSebGqG9GWPaNaCSjmlAdFGRdjDk5HmV4kgpbP0AtevkOlXAWg/viewform</w:t>
             </w:r>
           </w:p>
         </w:tc>
@@ -1292,29 +1280,29 @@
               <w:bottom w:val="single" w:color="D1D5DB" w:sz="4"/>
               <w:right w:val="single" w:color="D1D5DB" w:sz="4"/>
             </w:tcBorders>
-            <w:shd w:fill="FDE8E8" w:color="auto" w:val="clear"/>
-            <w:tcMar>
-              <w:top w:type="dxa" w:w="80"/>
-              <w:left w:type="dxa" w:w="110"/>
-              <w:bottom w:type="dxa" w:w="80"/>
-              <w:right w:type="dxa" w:w="110"/>
-            </w:tcMar>
-            <w:vAlign w:val="top"/>
-          </w:tcPr>
-          <w:p>
-            <w:pPr>
-              <w:spacing w:after="40" w:before="0"/>
-            </w:pPr>
-            <w:r>
-              <w:rPr>
-                <w:rFonts w:ascii="Arial" w:cs="Arial" w:eastAsia="Microsoft YaHei" w:hAnsi="Arial"/>
-                <w:b/>
-                <w:bCs/>
-                <w:color w:val="B91C1C"/>
-                <w:sz w:val="17"/>
-                <w:szCs w:val="17"/>
-              </w:rPr>
-              <w:t xml:space="preserve">必填 Required</w:t>
+            <w:shd w:fill="FEF3C7" w:color="auto" w:val="clear"/>
+            <w:tcMar>
+              <w:top w:type="dxa" w:w="80"/>
+              <w:left w:type="dxa" w:w="110"/>
+              <w:bottom w:type="dxa" w:w="80"/>
+              <w:right w:type="dxa" w:w="110"/>
+            </w:tcMar>
+            <w:vAlign w:val="top"/>
+          </w:tcPr>
+          <w:p>
+            <w:pPr>
+              <w:spacing w:after="40" w:before="0"/>
+            </w:pPr>
+            <w:r>
+              <w:rPr>
+                <w:rFonts w:ascii="Arial" w:cs="Arial" w:eastAsia="Microsoft YaHei" w:hAnsi="Arial"/>
+                <w:b/>
+                <w:bCs/>
+                <w:color w:val="92400E"/>
+                <w:sz w:val="17"/>
+                <w:szCs w:val="17"/>
+              </w:rPr>
+              <w:t xml:space="preserve">请确认 Confirm</w:t>
             </w:r>
           </w:p>
         </w:tc>

</xml_diff>

<commit_message>
Serve site from custom domain www.theinfnitesports.com
Drop the /infinite-sports base path, add public/CNAME, update tests,
README DNS instructions, and the content checklist domain entry.

Co-Authored-By: Claude Opus 5.5 <noreply@anthropic.com>
Claude-Session: https://claude.ai/code/session_01MP287J4ytmKJQmpMcNBeyF
</commit_message>
<xml_diff>
--- a/docs/Infinite-Sports-网站内容收集清单.docx
+++ b/docs/Infinite-Sports-网站内容收集清单.docx
@@ -115,7 +115,7 @@
                 <w:sz w:val="19"/>
                 <w:szCs w:val="19"/>
               </w:rPr>
-              <w:t xml:space="preserve">网站预览 Preview</w:t>
+              <w:t xml:space="preserve">网站地址 Website</w:t>
             </w:r>
           </w:p>
         </w:tc>
@@ -146,7 +146,7 @@
                 <w:sz w:val="19"/>
                 <w:szCs w:val="19"/>
               </w:rPr>
-              <w:t xml:space="preserve">https://steven-zhc.github.io/infinite-sports/</w:t>
+              <w:t xml:space="preserve">https://www.theinfnitesports.com/（绑定完成前请用 https://steven-zhc.github.io/infinite-sports/）</w:t>
             </w:r>
           </w:p>
         </w:tc>
@@ -417,7 +417,7 @@
                 <w:sz w:val="19"/>
                 <w:szCs w:val="19"/>
               </w:rPr>
-              <w:t xml:space="preserve">v3（已预填，含报名链接）· 2026-10-01</w:t>
+              <w:t xml:space="preserve">v4（已预填，含报名链接与域名）· 2026-10-01</w:t>
             </w:r>
           </w:p>
         </w:tc>
@@ -1951,7 +1951,7 @@
                 <w:sz w:val="16"/>
                 <w:szCs w:val="16"/>
               </w:rPr>
-              <w:t xml:space="preserve">说明：如已购买域名（如 infinitesports.com），请提供，我们协助绑定。</w:t>
+              <w:t xml:space="preserve">说明：已购买域名，正在绑定到网站。</w:t>
             </w:r>
           </w:p>
         </w:tc>
@@ -1980,22 +1980,10 @@
             <w:r>
               <w:rPr>
                 <w:rFonts w:ascii="Arial" w:cs="Arial" w:eastAsia="Microsoft YaHei" w:hAnsi="Arial"/>
-                <w:b/>
-                <w:bCs/>
-                <w:color w:val="E8590C"/>
-                <w:sz w:val="17"/>
-                <w:szCs w:val="17"/>
-              </w:rPr>
-              <w:t xml:space="preserve">【示例】</w:t>
-            </w:r>
-            <w:r>
-              <w:rPr>
-                <w:rFonts w:ascii="Arial" w:cs="Arial" w:eastAsia="Microsoft YaHei" w:hAnsi="Arial"/>
-                <w:color w:val="1D4ED8"/>
                 <w:sz w:val="19"/>
                 <w:szCs w:val="19"/>
               </w:rPr>
-              <w:t xml:space="preserve">www.infinitesports.com（如暂无，保留临时地址）</w:t>
+              <w:t xml:space="preserve">www.theinfnitesports.com</w:t>
             </w:r>
           </w:p>
         </w:tc>
@@ -2008,29 +1996,29 @@
               <w:bottom w:val="single" w:color="D1D5DB" w:sz="4"/>
               <w:right w:val="single" w:color="D1D5DB" w:sz="4"/>
             </w:tcBorders>
-            <w:shd w:fill="F3F4F6" w:color="auto" w:val="clear"/>
-            <w:tcMar>
-              <w:top w:type="dxa" w:w="80"/>
-              <w:left w:type="dxa" w:w="110"/>
-              <w:bottom w:type="dxa" w:w="80"/>
-              <w:right w:type="dxa" w:w="110"/>
-            </w:tcMar>
-            <w:vAlign w:val="top"/>
-          </w:tcPr>
-          <w:p>
-            <w:pPr>
-              <w:spacing w:after="40" w:before="0"/>
-            </w:pPr>
-            <w:r>
-              <w:rPr>
-                <w:rFonts w:ascii="Arial" w:cs="Arial" w:eastAsia="Microsoft YaHei" w:hAnsi="Arial"/>
-                <w:b/>
-                <w:bCs/>
-                <w:color w:val="374151"/>
-                <w:sz w:val="17"/>
-                <w:szCs w:val="17"/>
-              </w:rPr>
-              <w:t xml:space="preserve">可选 Optional</w:t>
+            <w:shd w:fill="FEF3C7" w:color="auto" w:val="clear"/>
+            <w:tcMar>
+              <w:top w:type="dxa" w:w="80"/>
+              <w:left w:type="dxa" w:w="110"/>
+              <w:bottom w:type="dxa" w:w="80"/>
+              <w:right w:type="dxa" w:w="110"/>
+            </w:tcMar>
+            <w:vAlign w:val="top"/>
+          </w:tcPr>
+          <w:p>
+            <w:pPr>
+              <w:spacing w:after="40" w:before="0"/>
+            </w:pPr>
+            <w:r>
+              <w:rPr>
+                <w:rFonts w:ascii="Arial" w:cs="Arial" w:eastAsia="Microsoft YaHei" w:hAnsi="Arial"/>
+                <w:b/>
+                <w:bCs/>
+                <w:color w:val="92400E"/>
+                <w:sz w:val="17"/>
+                <w:szCs w:val="17"/>
+              </w:rPr>
+              <w:t xml:space="preserve">请确认 Confirm</w:t>
             </w:r>
           </w:p>
         </w:tc>

</xml_diff>

<commit_message>
Show three campuses in the campus section
Replace the single location/hours block with a campus list (name,
address, hours, optional directions link), point the contact section
to it, and update the content checklist with per-campus fields.

Co-Authored-By: Claude Opus 5.5 <noreply@anthropic.com>
Claude-Session: https://claude.ai/code/session_01MP287J4ytmKJQmpMcNBeyF
</commit_message>
<xml_diff>
--- a/docs/Infinite-Sports-网站内容收集清单.docx
+++ b/docs/Infinite-Sports-网站内容收集清单.docx
@@ -417,7 +417,7 @@
                 <w:sz w:val="19"/>
                 <w:szCs w:val="19"/>
               </w:rPr>
-              <w:t xml:space="preserve">v4（已预填，含报名链接与域名）· 2026-10-01</w:t>
+              <w:t xml:space="preserve">v5（3 个校区）· 2026-10-01</w:t>
             </w:r>
           </w:p>
         </w:tc>
@@ -2539,7 +2539,7 @@
                 <w:sz w:val="19"/>
                 <w:szCs w:val="19"/>
               </w:rPr>
-              <w:t xml:space="preserve">Programs · Campus · Our team · Gallery · Contact</w:t>
+              <w:t xml:space="preserve">Programs · Campuses · Our team · Gallery · Contact</w:t>
             </w:r>
           </w:p>
         </w:tc>
@@ -2571,7 +2571,7 @@
                 <w:sz w:val="19"/>
                 <w:szCs w:val="19"/>
               </w:rPr>
-              <w:t xml:space="preserve">Programs · Campus · Our team · Gallery · Contact</w:t>
+              <w:t xml:space="preserve">Programs · Campuses · Our team · Gallery · Contact</w:t>
             </w:r>
           </w:p>
         </w:tc>
@@ -9815,7 +9815,7 @@
           <w:sz w:val="23"/>
           <w:szCs w:val="23"/>
         </w:rPr>
-        <w:t xml:space="preserve">E. 场馆  Campus</w:t>
+        <w:t xml:space="preserve">E. 校区  Campuses（共 3 个）</w:t>
       </w:r>
     </w:p>
     <w:tbl>
@@ -10117,7 +10117,7 @@
                 <w:sz w:val="19"/>
                 <w:szCs w:val="19"/>
               </w:rPr>
-              <w:t xml:space="preserve">Our campus</w:t>
+              <w:t xml:space="preserve">Our campuses</w:t>
             </w:r>
           </w:p>
         </w:tc>
@@ -10149,7 +10149,7 @@
                 <w:sz w:val="19"/>
                 <w:szCs w:val="19"/>
               </w:rPr>
-              <w:t xml:space="preserve">Our campus</w:t>
+              <w:t xml:space="preserve">Our campuses</w:t>
             </w:r>
           </w:p>
         </w:tc>
@@ -10459,7 +10459,7 @@
                 <w:sz w:val="19"/>
                 <w:szCs w:val="19"/>
               </w:rPr>
-              <w:t xml:space="preserve">A welcoming training environment with room to learn, move, and get better—one purposeful session at a time.</w:t>
+              <w:t xml:space="preserve">Three welcoming training locations with room to learn, move, and get better—choose the one closest to you.</w:t>
             </w:r>
           </w:p>
           <w:p>
@@ -10475,7 +10475,7 @@
                 <w:sz w:val="16"/>
                 <w:szCs w:val="16"/>
               </w:rPr>
-              <w:t xml:space="preserve">说明：可补充场馆特色：面积、场地数量、设施、停车等。</w:t>
+              <w:t xml:space="preserve">说明：句首的数量会随校区个数自动变化。</w:t>
             </w:r>
           </w:p>
         </w:tc>
@@ -10507,7 +10507,7 @@
                 <w:sz w:val="19"/>
                 <w:szCs w:val="19"/>
               </w:rPr>
-              <w:t xml:space="preserve">A welcoming training environment with room to learn, move, and get better—one purposeful session at a time.</w:t>
+              <w:t xml:space="preserve">Three welcoming training locations with room to learn, move, and get better—choose the one closest to you.</w:t>
             </w:r>
           </w:p>
         </w:tc>
@@ -10612,7 +10612,7 @@
                 <w:sz w:val="18"/>
                 <w:szCs w:val="18"/>
               </w:rPr>
-              <w:t xml:space="preserve">场馆地址 Location</w:t>
+              <w:t xml:space="preserve">按钮文字 Button</w:t>
             </w:r>
           </w:p>
         </w:tc>
@@ -10646,7 +10646,400 @@
                 <w:sz w:val="19"/>
                 <w:szCs w:val="19"/>
               </w:rPr>
-              <w:t xml:space="preserve">Campus address coming soon（占位）</w:t>
+              <w:t xml:space="preserve">Plan your first visit ↗</w:t>
+            </w:r>
+          </w:p>
+        </w:tc>
+        <w:tc>
+          <w:tcPr>
+            <w:tcW w:type="dxa" w:w="5238"/>
+            <w:tcBorders>
+              <w:top w:val="single" w:color="D1D5DB" w:sz="4"/>
+              <w:left w:val="single" w:color="D1D5DB" w:sz="4"/>
+              <w:bottom w:val="single" w:color="D1D5DB" w:sz="4"/>
+              <w:right w:val="single" w:color="D1D5DB" w:sz="4"/>
+            </w:tcBorders>
+            <w:shd w:fill="FFF8E7" w:color="auto" w:val="clear"/>
+            <w:tcMar>
+              <w:top w:type="dxa" w:w="80"/>
+              <w:left w:type="dxa" w:w="110"/>
+              <w:bottom w:type="dxa" w:w="80"/>
+              <w:right w:type="dxa" w:w="110"/>
+            </w:tcMar>
+            <w:vAlign w:val="top"/>
+          </w:tcPr>
+          <w:p>
+            <w:pPr>
+              <w:spacing w:after="40" w:before="0"/>
+            </w:pPr>
+            <w:r>
+              <w:rPr>
+                <w:rFonts w:ascii="Arial" w:cs="Arial" w:eastAsia="Microsoft YaHei" w:hAnsi="Arial"/>
+                <w:sz w:val="19"/>
+                <w:szCs w:val="19"/>
+              </w:rPr>
+              <w:t xml:space="preserve">Plan your first visit ↗</w:t>
+            </w:r>
+          </w:p>
+        </w:tc>
+        <w:tc>
+          <w:tcPr>
+            <w:tcW w:type="dxa" w:w="1400"/>
+            <w:tcBorders>
+              <w:top w:val="single" w:color="D1D5DB" w:sz="4"/>
+              <w:left w:val="single" w:color="D1D5DB" w:sz="4"/>
+              <w:bottom w:val="single" w:color="D1D5DB" w:sz="4"/>
+              <w:right w:val="single" w:color="D1D5DB" w:sz="4"/>
+            </w:tcBorders>
+            <w:shd w:fill="F3F4F6" w:color="auto" w:val="clear"/>
+            <w:tcMar>
+              <w:top w:type="dxa" w:w="80"/>
+              <w:left w:type="dxa" w:w="110"/>
+              <w:bottom w:type="dxa" w:w="80"/>
+              <w:right w:type="dxa" w:w="110"/>
+            </w:tcMar>
+            <w:vAlign w:val="top"/>
+          </w:tcPr>
+          <w:p>
+            <w:pPr>
+              <w:spacing w:after="40" w:before="0"/>
+            </w:pPr>
+            <w:r>
+              <w:rPr>
+                <w:rFonts w:ascii="Arial" w:cs="Arial" w:eastAsia="Microsoft YaHei" w:hAnsi="Arial"/>
+                <w:b/>
+                <w:bCs/>
+                <w:color w:val="374151"/>
+                <w:sz w:val="17"/>
+                <w:szCs w:val="17"/>
+              </w:rPr>
+              <w:t xml:space="preserve">可选 Optional</w:t>
+            </w:r>
+          </w:p>
+        </w:tc>
+      </w:tr>
+    </w:tbl>
+    <w:p>
+      <w:pPr>
+        <w:spacing w:after="60"/>
+      </w:pPr>
+    </w:p>
+    <w:p>
+      <w:pPr>
+        <w:spacing w:after="80" w:before="0"/>
+      </w:pPr>
+      <w:r>
+        <w:rPr>
+          <w:rFonts w:ascii="Arial" w:cs="Arial" w:eastAsia="Microsoft YaHei" w:hAnsi="Arial"/>
+          <w:b/>
+          <w:bCs/>
+          <w:color w:val="1F2328"/>
+          <w:sz w:val="20"/>
+          <w:szCs w:val="20"/>
+        </w:rPr>
+        <w:t xml:space="preserve">校区 01  Campus 01</w:t>
+      </w:r>
+    </w:p>
+    <w:tbl>
+      <w:tblPr>
+        <w:tblW w:type="dxa" w:w="14838"/>
+        <w:tblBorders>
+          <w:top w:val="single" w:color="auto" w:sz="4"/>
+          <w:left w:val="single" w:color="auto" w:sz="4"/>
+          <w:bottom w:val="single" w:color="auto" w:sz="4"/>
+          <w:right w:val="single" w:color="auto" w:sz="4"/>
+          <w:insideH w:val="single" w:color="auto" w:sz="4"/>
+          <w:insideV w:val="single" w:color="auto" w:sz="4"/>
+        </w:tblBorders>
+        <w:tblLayout w:type="fixed"/>
+      </w:tblPr>
+      <w:tblGrid>
+        <w:gridCol w:w="950"/>
+        <w:gridCol w:w="2700"/>
+        <w:gridCol w:w="4550"/>
+        <w:gridCol w:w="5238"/>
+        <w:gridCol w:w="1400"/>
+      </w:tblGrid>
+      <w:tr>
+        <w:trPr>
+          <w:tblHeader/>
+        </w:trPr>
+        <w:tc>
+          <w:tcPr>
+            <w:tcW w:type="dxa" w:w="950"/>
+            <w:tcBorders>
+              <w:top w:val="single" w:color="D1D5DB" w:sz="4"/>
+              <w:left w:val="single" w:color="D1D5DB" w:sz="4"/>
+              <w:bottom w:val="single" w:color="D1D5DB" w:sz="4"/>
+              <w:right w:val="single" w:color="D1D5DB" w:sz="4"/>
+            </w:tcBorders>
+            <w:shd w:fill="1F2328" w:color="auto" w:val="clear"/>
+            <w:tcMar>
+              <w:top w:type="dxa" w:w="80"/>
+              <w:left w:type="dxa" w:w="110"/>
+              <w:bottom w:type="dxa" w:w="80"/>
+              <w:right w:type="dxa" w:w="110"/>
+            </w:tcMar>
+            <w:vAlign w:val="center"/>
+          </w:tcPr>
+          <w:p>
+            <w:pPr>
+              <w:spacing w:after="40" w:before="0"/>
+            </w:pPr>
+            <w:r>
+              <w:rPr>
+                <w:rFonts w:ascii="Arial" w:cs="Arial" w:eastAsia="Microsoft YaHei" w:hAnsi="Arial"/>
+                <w:b/>
+                <w:bCs/>
+                <w:color w:val="FFFFFF"/>
+                <w:sz w:val="18"/>
+                <w:szCs w:val="18"/>
+              </w:rPr>
+              <w:t xml:space="preserve">编号 ID</w:t>
+            </w:r>
+          </w:p>
+        </w:tc>
+        <w:tc>
+          <w:tcPr>
+            <w:tcW w:type="dxa" w:w="2700"/>
+            <w:tcBorders>
+              <w:top w:val="single" w:color="D1D5DB" w:sz="4"/>
+              <w:left w:val="single" w:color="D1D5DB" w:sz="4"/>
+              <w:bottom w:val="single" w:color="D1D5DB" w:sz="4"/>
+              <w:right w:val="single" w:color="D1D5DB" w:sz="4"/>
+            </w:tcBorders>
+            <w:shd w:fill="1F2328" w:color="auto" w:val="clear"/>
+            <w:tcMar>
+              <w:top w:type="dxa" w:w="80"/>
+              <w:left w:type="dxa" w:w="110"/>
+              <w:bottom w:type="dxa" w:w="80"/>
+              <w:right w:type="dxa" w:w="110"/>
+            </w:tcMar>
+            <w:vAlign w:val="center"/>
+          </w:tcPr>
+          <w:p>
+            <w:pPr>
+              <w:spacing w:after="40" w:before="0"/>
+            </w:pPr>
+            <w:r>
+              <w:rPr>
+                <w:rFonts w:ascii="Arial" w:cs="Arial" w:eastAsia="Microsoft YaHei" w:hAnsi="Arial"/>
+                <w:b/>
+                <w:bCs/>
+                <w:color w:val="FFFFFF"/>
+                <w:sz w:val="18"/>
+                <w:szCs w:val="18"/>
+              </w:rPr>
+              <w:t xml:space="preserve">位置 / 字段  Location</w:t>
+            </w:r>
+          </w:p>
+        </w:tc>
+        <w:tc>
+          <w:tcPr>
+            <w:tcW w:type="dxa" w:w="4550"/>
+            <w:tcBorders>
+              <w:top w:val="single" w:color="D1D5DB" w:sz="4"/>
+              <w:left w:val="single" w:color="D1D5DB" w:sz="4"/>
+              <w:bottom w:val="single" w:color="D1D5DB" w:sz="4"/>
+              <w:right w:val="single" w:color="D1D5DB" w:sz="4"/>
+            </w:tcBorders>
+            <w:shd w:fill="1F2328" w:color="auto" w:val="clear"/>
+            <w:tcMar>
+              <w:top w:type="dxa" w:w="80"/>
+              <w:left w:type="dxa" w:w="110"/>
+              <w:bottom w:type="dxa" w:w="80"/>
+              <w:right w:type="dxa" w:w="110"/>
+            </w:tcMar>
+            <w:vAlign w:val="center"/>
+          </w:tcPr>
+          <w:p>
+            <w:pPr>
+              <w:spacing w:after="40" w:before="0"/>
+            </w:pPr>
+            <w:r>
+              <w:rPr>
+                <w:rFonts w:ascii="Arial" w:cs="Arial" w:eastAsia="Microsoft YaHei" w:hAnsi="Arial"/>
+                <w:b/>
+                <w:bCs/>
+                <w:color w:val="FFFFFF"/>
+                <w:sz w:val="18"/>
+                <w:szCs w:val="18"/>
+              </w:rPr>
+              <w:t xml:space="preserve">当前内容  Current text</w:t>
+            </w:r>
+          </w:p>
+        </w:tc>
+        <w:tc>
+          <w:tcPr>
+            <w:tcW w:type="dxa" w:w="5238"/>
+            <w:tcBorders>
+              <w:top w:val="single" w:color="D1D5DB" w:sz="4"/>
+              <w:left w:val="single" w:color="D1D5DB" w:sz="4"/>
+              <w:bottom w:val="single" w:color="D1D5DB" w:sz="4"/>
+              <w:right w:val="single" w:color="D1D5DB" w:sz="4"/>
+            </w:tcBorders>
+            <w:shd w:fill="1F2328" w:color="auto" w:val="clear"/>
+            <w:tcMar>
+              <w:top w:type="dxa" w:w="80"/>
+              <w:left w:type="dxa" w:w="110"/>
+              <w:bottom w:type="dxa" w:w="80"/>
+              <w:right w:type="dxa" w:w="110"/>
+            </w:tcMar>
+            <w:vAlign w:val="center"/>
+          </w:tcPr>
+          <w:p>
+            <w:pPr>
+              <w:spacing w:after="40" w:before="0"/>
+            </w:pPr>
+            <w:r>
+              <w:rPr>
+                <w:rFonts w:ascii="Arial" w:cs="Arial" w:eastAsia="Microsoft YaHei" w:hAnsi="Arial"/>
+                <w:b/>
+                <w:bCs/>
+                <w:color w:val="FFFFFF"/>
+                <w:sz w:val="18"/>
+                <w:szCs w:val="18"/>
+              </w:rPr>
+              <w:t xml:space="preserve">新内容（客户填写）  New text</w:t>
+            </w:r>
+          </w:p>
+        </w:tc>
+        <w:tc>
+          <w:tcPr>
+            <w:tcW w:type="dxa" w:w="1400"/>
+            <w:tcBorders>
+              <w:top w:val="single" w:color="D1D5DB" w:sz="4"/>
+              <w:left w:val="single" w:color="D1D5DB" w:sz="4"/>
+              <w:bottom w:val="single" w:color="D1D5DB" w:sz="4"/>
+              <w:right w:val="single" w:color="D1D5DB" w:sz="4"/>
+            </w:tcBorders>
+            <w:shd w:fill="1F2328" w:color="auto" w:val="clear"/>
+            <w:tcMar>
+              <w:top w:type="dxa" w:w="80"/>
+              <w:left w:type="dxa" w:w="110"/>
+              <w:bottom w:type="dxa" w:w="80"/>
+              <w:right w:type="dxa" w:w="110"/>
+            </w:tcMar>
+            <w:vAlign w:val="center"/>
+          </w:tcPr>
+          <w:p>
+            <w:pPr>
+              <w:spacing w:after="40" w:before="0"/>
+            </w:pPr>
+            <w:r>
+              <w:rPr>
+                <w:rFonts w:ascii="Arial" w:cs="Arial" w:eastAsia="Microsoft YaHei" w:hAnsi="Arial"/>
+                <w:b/>
+                <w:bCs/>
+                <w:color w:val="FFFFFF"/>
+                <w:sz w:val="18"/>
+                <w:szCs w:val="18"/>
+              </w:rPr>
+              <w:t xml:space="preserve">优先级</w:t>
+            </w:r>
+          </w:p>
+        </w:tc>
+      </w:tr>
+      <w:tr>
+        <w:trPr>
+          <w:cantSplit/>
+        </w:trPr>
+        <w:tc>
+          <w:tcPr>
+            <w:tcW w:type="dxa" w:w="950"/>
+            <w:tcBorders>
+              <w:top w:val="single" w:color="D1D5DB" w:sz="4"/>
+              <w:left w:val="single" w:color="D1D5DB" w:sz="4"/>
+              <w:bottom w:val="single" w:color="D1D5DB" w:sz="4"/>
+              <w:right w:val="single" w:color="D1D5DB" w:sz="4"/>
+            </w:tcBorders>
+            <w:tcMar>
+              <w:top w:type="dxa" w:w="80"/>
+              <w:left w:type="dxa" w:w="110"/>
+              <w:bottom w:type="dxa" w:w="80"/>
+              <w:right w:type="dxa" w:w="110"/>
+            </w:tcMar>
+            <w:vAlign w:val="top"/>
+          </w:tcPr>
+          <w:p>
+            <w:pPr>
+              <w:spacing w:after="40" w:before="0"/>
+            </w:pPr>
+            <w:r>
+              <w:rPr>
+                <w:rFonts w:ascii="Arial" w:cs="Arial" w:eastAsia="Microsoft YaHei" w:hAnsi="Arial"/>
+                <w:b/>
+                <w:bCs/>
+                <w:color w:val="E8590C"/>
+                <w:sz w:val="17"/>
+                <w:szCs w:val="17"/>
+              </w:rPr>
+              <w:t xml:space="preserve">E-11</w:t>
+            </w:r>
+          </w:p>
+        </w:tc>
+        <w:tc>
+          <w:tcPr>
+            <w:tcW w:type="dxa" w:w="2700"/>
+            <w:tcBorders>
+              <w:top w:val="single" w:color="D1D5DB" w:sz="4"/>
+              <w:left w:val="single" w:color="D1D5DB" w:sz="4"/>
+              <w:bottom w:val="single" w:color="D1D5DB" w:sz="4"/>
+              <w:right w:val="single" w:color="D1D5DB" w:sz="4"/>
+            </w:tcBorders>
+            <w:tcMar>
+              <w:top w:type="dxa" w:w="80"/>
+              <w:left w:type="dxa" w:w="110"/>
+              <w:bottom w:type="dxa" w:w="80"/>
+              <w:right w:type="dxa" w:w="110"/>
+            </w:tcMar>
+            <w:vAlign w:val="top"/>
+          </w:tcPr>
+          <w:p>
+            <w:pPr>
+              <w:spacing w:after="40" w:before="0"/>
+            </w:pPr>
+            <w:r>
+              <w:rPr>
+                <w:rFonts w:ascii="Arial" w:cs="Arial" w:eastAsia="Microsoft YaHei" w:hAnsi="Arial"/>
+                <w:sz w:val="18"/>
+                <w:szCs w:val="18"/>
+              </w:rPr>
+              <w:t xml:space="preserve">校区名称 Campus name</w:t>
+            </w:r>
+          </w:p>
+        </w:tc>
+        <w:tc>
+          <w:tcPr>
+            <w:tcW w:type="dxa" w:w="4550"/>
+            <w:tcBorders>
+              <w:top w:val="single" w:color="D1D5DB" w:sz="4"/>
+              <w:left w:val="single" w:color="D1D5DB" w:sz="4"/>
+              <w:bottom w:val="single" w:color="D1D5DB" w:sz="4"/>
+              <w:right w:val="single" w:color="D1D5DB" w:sz="4"/>
+            </w:tcBorders>
+            <w:tcMar>
+              <w:top w:type="dxa" w:w="80"/>
+              <w:left w:type="dxa" w:w="110"/>
+              <w:bottom w:type="dxa" w:w="80"/>
+              <w:right w:type="dxa" w:w="110"/>
+            </w:tcMar>
+            <w:vAlign w:val="top"/>
+          </w:tcPr>
+          <w:p>
+            <w:pPr>
+              <w:spacing w:after="40" w:before="0"/>
+            </w:pPr>
+            <w:r>
+              <w:rPr>
+                <w:rFonts w:ascii="Arial" w:cs="Arial" w:eastAsia="Microsoft YaHei" w:hAnsi="Arial"/>
+                <w:i w:val="false"/>
+                <w:iCs w:val="false"/>
+                <w:color w:val="1F2328"/>
+                <w:sz w:val="19"/>
+                <w:szCs w:val="19"/>
+              </w:rPr>
+              <w:t xml:space="preserve">Campus name coming soon（占位）</w:t>
             </w:r>
           </w:p>
           <w:p>
@@ -10662,7 +11055,7 @@
                 <w:sz w:val="16"/>
                 <w:szCs w:val="16"/>
               </w:rPr>
-              <w:t xml:space="preserve">说明：完整地址；如需要可同时提供 Google Maps 链接。</w:t>
+              <w:t xml:space="preserve">说明：例如 “Irvine Campus” 或场馆名称。</w:t>
             </w:r>
           </w:p>
         </w:tc>
@@ -10706,7 +11099,7 @@
                 <w:sz w:val="19"/>
                 <w:szCs w:val="19"/>
               </w:rPr>
-              <w:t xml:space="preserve">Street address, City, State ZIP</w:t>
+              <w:t xml:space="preserve">___ Campus</w:t>
             </w:r>
           </w:p>
         </w:tc>
@@ -10780,7 +11173,7 @@
                 <w:sz w:val="17"/>
                 <w:szCs w:val="17"/>
               </w:rPr>
-              <w:t xml:space="preserve">E-05</w:t>
+              <w:t xml:space="preserve">E-12</w:t>
             </w:r>
           </w:p>
         </w:tc>
@@ -10811,7 +11204,7 @@
                 <w:sz w:val="18"/>
                 <w:szCs w:val="18"/>
               </w:rPr>
-              <w:t xml:space="preserve">训练时间 Training hours</w:t>
+              <w:t xml:space="preserve">地址 Address</w:t>
             </w:r>
           </w:p>
         </w:tc>
@@ -10845,7 +11238,190 @@
                 <w:sz w:val="19"/>
                 <w:szCs w:val="19"/>
               </w:rPr>
-              <w:t xml:space="preserve">Class schedule coming soon（占位）</w:t>
+              <w:t xml:space="preserve">Address coming soon（占位）</w:t>
+            </w:r>
+          </w:p>
+        </w:tc>
+        <w:tc>
+          <w:tcPr>
+            <w:tcW w:type="dxa" w:w="5238"/>
+            <w:tcBorders>
+              <w:top w:val="single" w:color="D1D5DB" w:sz="4"/>
+              <w:left w:val="single" w:color="D1D5DB" w:sz="4"/>
+              <w:bottom w:val="single" w:color="D1D5DB" w:sz="4"/>
+              <w:right w:val="single" w:color="D1D5DB" w:sz="4"/>
+            </w:tcBorders>
+            <w:shd w:fill="FFF8E7" w:color="auto" w:val="clear"/>
+            <w:tcMar>
+              <w:top w:type="dxa" w:w="80"/>
+              <w:left w:type="dxa" w:w="110"/>
+              <w:bottom w:type="dxa" w:w="80"/>
+              <w:right w:type="dxa" w:w="110"/>
+            </w:tcMar>
+            <w:vAlign w:val="top"/>
+          </w:tcPr>
+          <w:p>
+            <w:pPr>
+              <w:spacing w:after="40" w:before="0"/>
+            </w:pPr>
+            <w:r>
+              <w:rPr>
+                <w:rFonts w:ascii="Arial" w:cs="Arial" w:eastAsia="Microsoft YaHei" w:hAnsi="Arial"/>
+                <w:b/>
+                <w:bCs/>
+                <w:color w:val="E8590C"/>
+                <w:sz w:val="17"/>
+                <w:szCs w:val="17"/>
+              </w:rPr>
+              <w:t xml:space="preserve">【请填写】</w:t>
+            </w:r>
+            <w:r>
+              <w:rPr>
+                <w:rFonts w:ascii="Arial" w:cs="Arial" w:eastAsia="Microsoft YaHei" w:hAnsi="Arial"/>
+                <w:color w:val="1D4ED8"/>
+                <w:sz w:val="19"/>
+                <w:szCs w:val="19"/>
+              </w:rPr>
+              <w:t xml:space="preserve">Street address, City, State ZIP</w:t>
+            </w:r>
+          </w:p>
+        </w:tc>
+        <w:tc>
+          <w:tcPr>
+            <w:tcW w:type="dxa" w:w="1400"/>
+            <w:tcBorders>
+              <w:top w:val="single" w:color="D1D5DB" w:sz="4"/>
+              <w:left w:val="single" w:color="D1D5DB" w:sz="4"/>
+              <w:bottom w:val="single" w:color="D1D5DB" w:sz="4"/>
+              <w:right w:val="single" w:color="D1D5DB" w:sz="4"/>
+            </w:tcBorders>
+            <w:shd w:fill="FDE8E8" w:color="auto" w:val="clear"/>
+            <w:tcMar>
+              <w:top w:type="dxa" w:w="80"/>
+              <w:left w:type="dxa" w:w="110"/>
+              <w:bottom w:type="dxa" w:w="80"/>
+              <w:right w:type="dxa" w:w="110"/>
+            </w:tcMar>
+            <w:vAlign w:val="top"/>
+          </w:tcPr>
+          <w:p>
+            <w:pPr>
+              <w:spacing w:after="40" w:before="0"/>
+            </w:pPr>
+            <w:r>
+              <w:rPr>
+                <w:rFonts w:ascii="Arial" w:cs="Arial" w:eastAsia="Microsoft YaHei" w:hAnsi="Arial"/>
+                <w:b/>
+                <w:bCs/>
+                <w:color w:val="B91C1C"/>
+                <w:sz w:val="17"/>
+                <w:szCs w:val="17"/>
+              </w:rPr>
+              <w:t xml:space="preserve">必填 Required</w:t>
+            </w:r>
+          </w:p>
+        </w:tc>
+      </w:tr>
+      <w:tr>
+        <w:trPr>
+          <w:cantSplit/>
+        </w:trPr>
+        <w:tc>
+          <w:tcPr>
+            <w:tcW w:type="dxa" w:w="950"/>
+            <w:tcBorders>
+              <w:top w:val="single" w:color="D1D5DB" w:sz="4"/>
+              <w:left w:val="single" w:color="D1D5DB" w:sz="4"/>
+              <w:bottom w:val="single" w:color="D1D5DB" w:sz="4"/>
+              <w:right w:val="single" w:color="D1D5DB" w:sz="4"/>
+            </w:tcBorders>
+            <w:tcMar>
+              <w:top w:type="dxa" w:w="80"/>
+              <w:left w:type="dxa" w:w="110"/>
+              <w:bottom w:type="dxa" w:w="80"/>
+              <w:right w:type="dxa" w:w="110"/>
+            </w:tcMar>
+            <w:vAlign w:val="top"/>
+          </w:tcPr>
+          <w:p>
+            <w:pPr>
+              <w:spacing w:after="40" w:before="0"/>
+            </w:pPr>
+            <w:r>
+              <w:rPr>
+                <w:rFonts w:ascii="Arial" w:cs="Arial" w:eastAsia="Microsoft YaHei" w:hAnsi="Arial"/>
+                <w:b/>
+                <w:bCs/>
+                <w:color w:val="E8590C"/>
+                <w:sz w:val="17"/>
+                <w:szCs w:val="17"/>
+              </w:rPr>
+              <w:t xml:space="preserve">E-13</w:t>
+            </w:r>
+          </w:p>
+        </w:tc>
+        <w:tc>
+          <w:tcPr>
+            <w:tcW w:type="dxa" w:w="2700"/>
+            <w:tcBorders>
+              <w:top w:val="single" w:color="D1D5DB" w:sz="4"/>
+              <w:left w:val="single" w:color="D1D5DB" w:sz="4"/>
+              <w:bottom w:val="single" w:color="D1D5DB" w:sz="4"/>
+              <w:right w:val="single" w:color="D1D5DB" w:sz="4"/>
+            </w:tcBorders>
+            <w:tcMar>
+              <w:top w:type="dxa" w:w="80"/>
+              <w:left w:type="dxa" w:w="110"/>
+              <w:bottom w:type="dxa" w:w="80"/>
+              <w:right w:type="dxa" w:w="110"/>
+            </w:tcMar>
+            <w:vAlign w:val="top"/>
+          </w:tcPr>
+          <w:p>
+            <w:pPr>
+              <w:spacing w:after="40" w:before="0"/>
+            </w:pPr>
+            <w:r>
+              <w:rPr>
+                <w:rFonts w:ascii="Arial" w:cs="Arial" w:eastAsia="Microsoft YaHei" w:hAnsi="Arial"/>
+                <w:sz w:val="18"/>
+                <w:szCs w:val="18"/>
+              </w:rPr>
+              <w:t xml:space="preserve">训练时间 Training hours</w:t>
+            </w:r>
+          </w:p>
+        </w:tc>
+        <w:tc>
+          <w:tcPr>
+            <w:tcW w:type="dxa" w:w="4550"/>
+            <w:tcBorders>
+              <w:top w:val="single" w:color="D1D5DB" w:sz="4"/>
+              <w:left w:val="single" w:color="D1D5DB" w:sz="4"/>
+              <w:bottom w:val="single" w:color="D1D5DB" w:sz="4"/>
+              <w:right w:val="single" w:color="D1D5DB" w:sz="4"/>
+            </w:tcBorders>
+            <w:tcMar>
+              <w:top w:type="dxa" w:w="80"/>
+              <w:left w:type="dxa" w:w="110"/>
+              <w:bottom w:type="dxa" w:w="80"/>
+              <w:right w:type="dxa" w:w="110"/>
+            </w:tcMar>
+            <w:vAlign w:val="top"/>
+          </w:tcPr>
+          <w:p>
+            <w:pPr>
+              <w:spacing w:after="40" w:before="0"/>
+            </w:pPr>
+            <w:r>
+              <w:rPr>
+                <w:rFonts w:ascii="Arial" w:cs="Arial" w:eastAsia="Microsoft YaHei" w:hAnsi="Arial"/>
+                <w:i w:val="false"/>
+                <w:iCs w:val="false"/>
+                <w:color w:val="1F2328"/>
+                <w:sz w:val="19"/>
+                <w:szCs w:val="19"/>
+              </w:rPr>
+              <w:t xml:space="preserve">Schedule coming soon（占位）</w:t>
             </w:r>
           </w:p>
           <w:p>
@@ -10861,7 +11437,7 @@
                 <w:sz w:val="16"/>
                 <w:szCs w:val="16"/>
               </w:rPr>
-              <w:t xml:space="preserve">说明：例如 “Mon–Fri 4–8 pm · Sat 9 am–3 pm”。</w:t>
+              <w:t xml:space="preserve">说明：可写该校区开设的课程，如 “Volleyball · Mon/Wed 5–7 pm”。</w:t>
             </w:r>
           </w:p>
         </w:tc>
@@ -10979,7 +11555,7 @@
                 <w:sz w:val="17"/>
                 <w:szCs w:val="17"/>
               </w:rPr>
-              <w:t xml:space="preserve">E-06</w:t>
+              <w:t xml:space="preserve">E-14</w:t>
             </w:r>
           </w:p>
         </w:tc>
@@ -11010,7 +11586,428 @@
                 <w:sz w:val="18"/>
                 <w:szCs w:val="18"/>
               </w:rPr>
-              <w:t xml:space="preserve">按钮文字 Button</w:t>
+              <w:t xml:space="preserve">地图链接 Google Maps link</w:t>
+            </w:r>
+          </w:p>
+        </w:tc>
+        <w:tc>
+          <w:tcPr>
+            <w:tcW w:type="dxa" w:w="4550"/>
+            <w:tcBorders>
+              <w:top w:val="single" w:color="D1D5DB" w:sz="4"/>
+              <w:left w:val="single" w:color="D1D5DB" w:sz="4"/>
+              <w:bottom w:val="single" w:color="D1D5DB" w:sz="4"/>
+              <w:right w:val="single" w:color="D1D5DB" w:sz="4"/>
+            </w:tcBorders>
+            <w:tcMar>
+              <w:top w:type="dxa" w:w="80"/>
+              <w:left w:type="dxa" w:w="110"/>
+              <w:bottom w:type="dxa" w:w="80"/>
+              <w:right w:type="dxa" w:w="110"/>
+            </w:tcMar>
+            <w:vAlign w:val="top"/>
+          </w:tcPr>
+          <w:p>
+            <w:pPr>
+              <w:spacing w:after="40" w:before="0"/>
+            </w:pPr>
+            <w:r>
+              <w:rPr>
+                <w:rFonts w:ascii="Arial" w:cs="Arial" w:eastAsia="Microsoft YaHei" w:hAnsi="Arial"/>
+                <w:i/>
+                <w:iCs/>
+                <w:color w:val="6B7280"/>
+                <w:sz w:val="19"/>
+                <w:szCs w:val="19"/>
+              </w:rPr>
+              <w:t xml:space="preserve">（目前未展示）</w:t>
+            </w:r>
+          </w:p>
+          <w:p>
+            <w:pPr>
+              <w:spacing w:after="40" w:before="0"/>
+            </w:pPr>
+            <w:r>
+              <w:rPr>
+                <w:rFonts w:ascii="Arial" w:cs="Arial" w:eastAsia="Microsoft YaHei" w:hAnsi="Arial"/>
+                <w:i/>
+                <w:iCs/>
+                <w:color w:val="6B7280"/>
+                <w:sz w:val="16"/>
+                <w:szCs w:val="16"/>
+              </w:rPr>
+              <w:t xml:space="preserve">说明：在 Google Maps 搜到场馆 → 分享 → 复制链接。提供后会显示 “Directions ↗” 按钮。</w:t>
+            </w:r>
+          </w:p>
+        </w:tc>
+        <w:tc>
+          <w:tcPr>
+            <w:tcW w:type="dxa" w:w="5238"/>
+            <w:tcBorders>
+              <w:top w:val="single" w:color="D1D5DB" w:sz="4"/>
+              <w:left w:val="single" w:color="D1D5DB" w:sz="4"/>
+              <w:bottom w:val="single" w:color="D1D5DB" w:sz="4"/>
+              <w:right w:val="single" w:color="D1D5DB" w:sz="4"/>
+            </w:tcBorders>
+            <w:shd w:fill="FFF8E7" w:color="auto" w:val="clear"/>
+            <w:tcMar>
+              <w:top w:type="dxa" w:w="80"/>
+              <w:left w:type="dxa" w:w="110"/>
+              <w:bottom w:type="dxa" w:w="80"/>
+              <w:right w:type="dxa" w:w="110"/>
+            </w:tcMar>
+            <w:vAlign w:val="top"/>
+          </w:tcPr>
+          <w:p>
+            <w:pPr>
+              <w:spacing w:after="40" w:before="0"/>
+            </w:pPr>
+            <w:r>
+              <w:rPr>
+                <w:rFonts w:ascii="Arial" w:cs="Arial" w:eastAsia="Microsoft YaHei" w:hAnsi="Arial"/>
+                <w:b/>
+                <w:bCs/>
+                <w:color w:val="E8590C"/>
+                <w:sz w:val="17"/>
+                <w:szCs w:val="17"/>
+              </w:rPr>
+              <w:t xml:space="preserve">【请填写】</w:t>
+            </w:r>
+            <w:r>
+              <w:rPr>
+                <w:rFonts w:ascii="Arial" w:cs="Arial" w:eastAsia="Microsoft YaHei" w:hAnsi="Arial"/>
+                <w:color w:val="1D4ED8"/>
+                <w:sz w:val="19"/>
+                <w:szCs w:val="19"/>
+              </w:rPr>
+              <w:t xml:space="preserve">https://maps.app.goo.gl/…</w:t>
+            </w:r>
+          </w:p>
+        </w:tc>
+        <w:tc>
+          <w:tcPr>
+            <w:tcW w:type="dxa" w:w="1400"/>
+            <w:tcBorders>
+              <w:top w:val="single" w:color="D1D5DB" w:sz="4"/>
+              <w:left w:val="single" w:color="D1D5DB" w:sz="4"/>
+              <w:bottom w:val="single" w:color="D1D5DB" w:sz="4"/>
+              <w:right w:val="single" w:color="D1D5DB" w:sz="4"/>
+            </w:tcBorders>
+            <w:shd w:fill="E0ECFF" w:color="auto" w:val="clear"/>
+            <w:tcMar>
+              <w:top w:type="dxa" w:w="80"/>
+              <w:left w:type="dxa" w:w="110"/>
+              <w:bottom w:type="dxa" w:w="80"/>
+              <w:right w:type="dxa" w:w="110"/>
+            </w:tcMar>
+            <w:vAlign w:val="top"/>
+          </w:tcPr>
+          <w:p>
+            <w:pPr>
+              <w:spacing w:after="40" w:before="0"/>
+            </w:pPr>
+            <w:r>
+              <w:rPr>
+                <w:rFonts w:ascii="Arial" w:cs="Arial" w:eastAsia="Microsoft YaHei" w:hAnsi="Arial"/>
+                <w:b/>
+                <w:bCs/>
+                <w:color w:val="1D4ED8"/>
+                <w:sz w:val="17"/>
+                <w:szCs w:val="17"/>
+              </w:rPr>
+              <w:t xml:space="preserve">新增 New</w:t>
+            </w:r>
+          </w:p>
+        </w:tc>
+      </w:tr>
+    </w:tbl>
+    <w:p>
+      <w:pPr>
+        <w:spacing w:after="60"/>
+      </w:pPr>
+    </w:p>
+    <w:p>
+      <w:pPr>
+        <w:spacing w:after="80" w:before="0"/>
+      </w:pPr>
+      <w:r>
+        <w:rPr>
+          <w:rFonts w:ascii="Arial" w:cs="Arial" w:eastAsia="Microsoft YaHei" w:hAnsi="Arial"/>
+          <w:b/>
+          <w:bCs/>
+          <w:color w:val="1F2328"/>
+          <w:sz w:val="20"/>
+          <w:szCs w:val="20"/>
+        </w:rPr>
+        <w:t xml:space="preserve">校区 02  Campus 02</w:t>
+      </w:r>
+    </w:p>
+    <w:tbl>
+      <w:tblPr>
+        <w:tblW w:type="dxa" w:w="14838"/>
+        <w:tblBorders>
+          <w:top w:val="single" w:color="auto" w:sz="4"/>
+          <w:left w:val="single" w:color="auto" w:sz="4"/>
+          <w:bottom w:val="single" w:color="auto" w:sz="4"/>
+          <w:right w:val="single" w:color="auto" w:sz="4"/>
+          <w:insideH w:val="single" w:color="auto" w:sz="4"/>
+          <w:insideV w:val="single" w:color="auto" w:sz="4"/>
+        </w:tblBorders>
+        <w:tblLayout w:type="fixed"/>
+      </w:tblPr>
+      <w:tblGrid>
+        <w:gridCol w:w="950"/>
+        <w:gridCol w:w="2700"/>
+        <w:gridCol w:w="4550"/>
+        <w:gridCol w:w="5238"/>
+        <w:gridCol w:w="1400"/>
+      </w:tblGrid>
+      <w:tr>
+        <w:trPr>
+          <w:tblHeader/>
+        </w:trPr>
+        <w:tc>
+          <w:tcPr>
+            <w:tcW w:type="dxa" w:w="950"/>
+            <w:tcBorders>
+              <w:top w:val="single" w:color="D1D5DB" w:sz="4"/>
+              <w:left w:val="single" w:color="D1D5DB" w:sz="4"/>
+              <w:bottom w:val="single" w:color="D1D5DB" w:sz="4"/>
+              <w:right w:val="single" w:color="D1D5DB" w:sz="4"/>
+            </w:tcBorders>
+            <w:shd w:fill="1F2328" w:color="auto" w:val="clear"/>
+            <w:tcMar>
+              <w:top w:type="dxa" w:w="80"/>
+              <w:left w:type="dxa" w:w="110"/>
+              <w:bottom w:type="dxa" w:w="80"/>
+              <w:right w:type="dxa" w:w="110"/>
+            </w:tcMar>
+            <w:vAlign w:val="center"/>
+          </w:tcPr>
+          <w:p>
+            <w:pPr>
+              <w:spacing w:after="40" w:before="0"/>
+            </w:pPr>
+            <w:r>
+              <w:rPr>
+                <w:rFonts w:ascii="Arial" w:cs="Arial" w:eastAsia="Microsoft YaHei" w:hAnsi="Arial"/>
+                <w:b/>
+                <w:bCs/>
+                <w:color w:val="FFFFFF"/>
+                <w:sz w:val="18"/>
+                <w:szCs w:val="18"/>
+              </w:rPr>
+              <w:t xml:space="preserve">编号 ID</w:t>
+            </w:r>
+          </w:p>
+        </w:tc>
+        <w:tc>
+          <w:tcPr>
+            <w:tcW w:type="dxa" w:w="2700"/>
+            <w:tcBorders>
+              <w:top w:val="single" w:color="D1D5DB" w:sz="4"/>
+              <w:left w:val="single" w:color="D1D5DB" w:sz="4"/>
+              <w:bottom w:val="single" w:color="D1D5DB" w:sz="4"/>
+              <w:right w:val="single" w:color="D1D5DB" w:sz="4"/>
+            </w:tcBorders>
+            <w:shd w:fill="1F2328" w:color="auto" w:val="clear"/>
+            <w:tcMar>
+              <w:top w:type="dxa" w:w="80"/>
+              <w:left w:type="dxa" w:w="110"/>
+              <w:bottom w:type="dxa" w:w="80"/>
+              <w:right w:type="dxa" w:w="110"/>
+            </w:tcMar>
+            <w:vAlign w:val="center"/>
+          </w:tcPr>
+          <w:p>
+            <w:pPr>
+              <w:spacing w:after="40" w:before="0"/>
+            </w:pPr>
+            <w:r>
+              <w:rPr>
+                <w:rFonts w:ascii="Arial" w:cs="Arial" w:eastAsia="Microsoft YaHei" w:hAnsi="Arial"/>
+                <w:b/>
+                <w:bCs/>
+                <w:color w:val="FFFFFF"/>
+                <w:sz w:val="18"/>
+                <w:szCs w:val="18"/>
+              </w:rPr>
+              <w:t xml:space="preserve">位置 / 字段  Location</w:t>
+            </w:r>
+          </w:p>
+        </w:tc>
+        <w:tc>
+          <w:tcPr>
+            <w:tcW w:type="dxa" w:w="4550"/>
+            <w:tcBorders>
+              <w:top w:val="single" w:color="D1D5DB" w:sz="4"/>
+              <w:left w:val="single" w:color="D1D5DB" w:sz="4"/>
+              <w:bottom w:val="single" w:color="D1D5DB" w:sz="4"/>
+              <w:right w:val="single" w:color="D1D5DB" w:sz="4"/>
+            </w:tcBorders>
+            <w:shd w:fill="1F2328" w:color="auto" w:val="clear"/>
+            <w:tcMar>
+              <w:top w:type="dxa" w:w="80"/>
+              <w:left w:type="dxa" w:w="110"/>
+              <w:bottom w:type="dxa" w:w="80"/>
+              <w:right w:type="dxa" w:w="110"/>
+            </w:tcMar>
+            <w:vAlign w:val="center"/>
+          </w:tcPr>
+          <w:p>
+            <w:pPr>
+              <w:spacing w:after="40" w:before="0"/>
+            </w:pPr>
+            <w:r>
+              <w:rPr>
+                <w:rFonts w:ascii="Arial" w:cs="Arial" w:eastAsia="Microsoft YaHei" w:hAnsi="Arial"/>
+                <w:b/>
+                <w:bCs/>
+                <w:color w:val="FFFFFF"/>
+                <w:sz w:val="18"/>
+                <w:szCs w:val="18"/>
+              </w:rPr>
+              <w:t xml:space="preserve">当前内容  Current text</w:t>
+            </w:r>
+          </w:p>
+        </w:tc>
+        <w:tc>
+          <w:tcPr>
+            <w:tcW w:type="dxa" w:w="5238"/>
+            <w:tcBorders>
+              <w:top w:val="single" w:color="D1D5DB" w:sz="4"/>
+              <w:left w:val="single" w:color="D1D5DB" w:sz="4"/>
+              <w:bottom w:val="single" w:color="D1D5DB" w:sz="4"/>
+              <w:right w:val="single" w:color="D1D5DB" w:sz="4"/>
+            </w:tcBorders>
+            <w:shd w:fill="1F2328" w:color="auto" w:val="clear"/>
+            <w:tcMar>
+              <w:top w:type="dxa" w:w="80"/>
+              <w:left w:type="dxa" w:w="110"/>
+              <w:bottom w:type="dxa" w:w="80"/>
+              <w:right w:type="dxa" w:w="110"/>
+            </w:tcMar>
+            <w:vAlign w:val="center"/>
+          </w:tcPr>
+          <w:p>
+            <w:pPr>
+              <w:spacing w:after="40" w:before="0"/>
+            </w:pPr>
+            <w:r>
+              <w:rPr>
+                <w:rFonts w:ascii="Arial" w:cs="Arial" w:eastAsia="Microsoft YaHei" w:hAnsi="Arial"/>
+                <w:b/>
+                <w:bCs/>
+                <w:color w:val="FFFFFF"/>
+                <w:sz w:val="18"/>
+                <w:szCs w:val="18"/>
+              </w:rPr>
+              <w:t xml:space="preserve">新内容（客户填写）  New text</w:t>
+            </w:r>
+          </w:p>
+        </w:tc>
+        <w:tc>
+          <w:tcPr>
+            <w:tcW w:type="dxa" w:w="1400"/>
+            <w:tcBorders>
+              <w:top w:val="single" w:color="D1D5DB" w:sz="4"/>
+              <w:left w:val="single" w:color="D1D5DB" w:sz="4"/>
+              <w:bottom w:val="single" w:color="D1D5DB" w:sz="4"/>
+              <w:right w:val="single" w:color="D1D5DB" w:sz="4"/>
+            </w:tcBorders>
+            <w:shd w:fill="1F2328" w:color="auto" w:val="clear"/>
+            <w:tcMar>
+              <w:top w:type="dxa" w:w="80"/>
+              <w:left w:type="dxa" w:w="110"/>
+              <w:bottom w:type="dxa" w:w="80"/>
+              <w:right w:type="dxa" w:w="110"/>
+            </w:tcMar>
+            <w:vAlign w:val="center"/>
+          </w:tcPr>
+          <w:p>
+            <w:pPr>
+              <w:spacing w:after="40" w:before="0"/>
+            </w:pPr>
+            <w:r>
+              <w:rPr>
+                <w:rFonts w:ascii="Arial" w:cs="Arial" w:eastAsia="Microsoft YaHei" w:hAnsi="Arial"/>
+                <w:b/>
+                <w:bCs/>
+                <w:color w:val="FFFFFF"/>
+                <w:sz w:val="18"/>
+                <w:szCs w:val="18"/>
+              </w:rPr>
+              <w:t xml:space="preserve">优先级</w:t>
+            </w:r>
+          </w:p>
+        </w:tc>
+      </w:tr>
+      <w:tr>
+        <w:trPr>
+          <w:cantSplit/>
+        </w:trPr>
+        <w:tc>
+          <w:tcPr>
+            <w:tcW w:type="dxa" w:w="950"/>
+            <w:tcBorders>
+              <w:top w:val="single" w:color="D1D5DB" w:sz="4"/>
+              <w:left w:val="single" w:color="D1D5DB" w:sz="4"/>
+              <w:bottom w:val="single" w:color="D1D5DB" w:sz="4"/>
+              <w:right w:val="single" w:color="D1D5DB" w:sz="4"/>
+            </w:tcBorders>
+            <w:tcMar>
+              <w:top w:type="dxa" w:w="80"/>
+              <w:left w:type="dxa" w:w="110"/>
+              <w:bottom w:type="dxa" w:w="80"/>
+              <w:right w:type="dxa" w:w="110"/>
+            </w:tcMar>
+            <w:vAlign w:val="top"/>
+          </w:tcPr>
+          <w:p>
+            <w:pPr>
+              <w:spacing w:after="40" w:before="0"/>
+            </w:pPr>
+            <w:r>
+              <w:rPr>
+                <w:rFonts w:ascii="Arial" w:cs="Arial" w:eastAsia="Microsoft YaHei" w:hAnsi="Arial"/>
+                <w:b/>
+                <w:bCs/>
+                <w:color w:val="E8590C"/>
+                <w:sz w:val="17"/>
+                <w:szCs w:val="17"/>
+              </w:rPr>
+              <w:t xml:space="preserve">E-21</w:t>
+            </w:r>
+          </w:p>
+        </w:tc>
+        <w:tc>
+          <w:tcPr>
+            <w:tcW w:type="dxa" w:w="2700"/>
+            <w:tcBorders>
+              <w:top w:val="single" w:color="D1D5DB" w:sz="4"/>
+              <w:left w:val="single" w:color="D1D5DB" w:sz="4"/>
+              <w:bottom w:val="single" w:color="D1D5DB" w:sz="4"/>
+              <w:right w:val="single" w:color="D1D5DB" w:sz="4"/>
+            </w:tcBorders>
+            <w:tcMar>
+              <w:top w:type="dxa" w:w="80"/>
+              <w:left w:type="dxa" w:w="110"/>
+              <w:bottom w:type="dxa" w:w="80"/>
+              <w:right w:type="dxa" w:w="110"/>
+            </w:tcMar>
+            <w:vAlign w:val="top"/>
+          </w:tcPr>
+          <w:p>
+            <w:pPr>
+              <w:spacing w:after="40" w:before="0"/>
+            </w:pPr>
+            <w:r>
+              <w:rPr>
+                <w:rFonts w:ascii="Arial" w:cs="Arial" w:eastAsia="Microsoft YaHei" w:hAnsi="Arial"/>
+                <w:sz w:val="18"/>
+                <w:szCs w:val="18"/>
+              </w:rPr>
+              <w:t xml:space="preserve">校区名称 Campus name</w:t>
             </w:r>
           </w:p>
         </w:tc>
@@ -11044,7 +12041,23 @@
                 <w:sz w:val="19"/>
                 <w:szCs w:val="19"/>
               </w:rPr>
-              <w:t xml:space="preserve">Plan your first visit ↗</w:t>
+              <w:t xml:space="preserve">Campus name coming soon（占位）</w:t>
+            </w:r>
+          </w:p>
+          <w:p>
+            <w:pPr>
+              <w:spacing w:after="40" w:before="0"/>
+            </w:pPr>
+            <w:r>
+              <w:rPr>
+                <w:rFonts w:ascii="Arial" w:cs="Arial" w:eastAsia="Microsoft YaHei" w:hAnsi="Arial"/>
+                <w:i/>
+                <w:iCs/>
+                <w:color w:val="6B7280"/>
+                <w:sz w:val="16"/>
+                <w:szCs w:val="16"/>
+              </w:rPr>
+              <w:t xml:space="preserve">说明：例如 “Irvine Campus” 或场馆名称。</w:t>
             </w:r>
           </w:p>
         </w:tc>
@@ -11073,10 +12086,22 @@
             <w:r>
               <w:rPr>
                 <w:rFonts w:ascii="Arial" w:cs="Arial" w:eastAsia="Microsoft YaHei" w:hAnsi="Arial"/>
+                <w:b/>
+                <w:bCs/>
+                <w:color w:val="E8590C"/>
+                <w:sz w:val="17"/>
+                <w:szCs w:val="17"/>
+              </w:rPr>
+              <w:t xml:space="preserve">【请填写】</w:t>
+            </w:r>
+            <w:r>
+              <w:rPr>
+                <w:rFonts w:ascii="Arial" w:cs="Arial" w:eastAsia="Microsoft YaHei" w:hAnsi="Arial"/>
+                <w:color w:val="1D4ED8"/>
                 <w:sz w:val="19"/>
                 <w:szCs w:val="19"/>
               </w:rPr>
-              <w:t xml:space="preserve">Plan your first visit ↗</w:t>
+              <w:t xml:space="preserve">___ Campus</w:t>
             </w:r>
           </w:p>
         </w:tc>
@@ -11089,29 +12114,1686 @@
               <w:bottom w:val="single" w:color="D1D5DB" w:sz="4"/>
               <w:right w:val="single" w:color="D1D5DB" w:sz="4"/>
             </w:tcBorders>
-            <w:shd w:fill="F3F4F6" w:color="auto" w:val="clear"/>
-            <w:tcMar>
-              <w:top w:type="dxa" w:w="80"/>
-              <w:left w:type="dxa" w:w="110"/>
-              <w:bottom w:type="dxa" w:w="80"/>
-              <w:right w:type="dxa" w:w="110"/>
-            </w:tcMar>
-            <w:vAlign w:val="top"/>
-          </w:tcPr>
-          <w:p>
-            <w:pPr>
-              <w:spacing w:after="40" w:before="0"/>
-            </w:pPr>
-            <w:r>
-              <w:rPr>
-                <w:rFonts w:ascii="Arial" w:cs="Arial" w:eastAsia="Microsoft YaHei" w:hAnsi="Arial"/>
-                <w:b/>
-                <w:bCs/>
-                <w:color w:val="374151"/>
-                <w:sz w:val="17"/>
-                <w:szCs w:val="17"/>
-              </w:rPr>
-              <w:t xml:space="preserve">可选 Optional</w:t>
+            <w:shd w:fill="FDE8E8" w:color="auto" w:val="clear"/>
+            <w:tcMar>
+              <w:top w:type="dxa" w:w="80"/>
+              <w:left w:type="dxa" w:w="110"/>
+              <w:bottom w:type="dxa" w:w="80"/>
+              <w:right w:type="dxa" w:w="110"/>
+            </w:tcMar>
+            <w:vAlign w:val="top"/>
+          </w:tcPr>
+          <w:p>
+            <w:pPr>
+              <w:spacing w:after="40" w:before="0"/>
+            </w:pPr>
+            <w:r>
+              <w:rPr>
+                <w:rFonts w:ascii="Arial" w:cs="Arial" w:eastAsia="Microsoft YaHei" w:hAnsi="Arial"/>
+                <w:b/>
+                <w:bCs/>
+                <w:color w:val="B91C1C"/>
+                <w:sz w:val="17"/>
+                <w:szCs w:val="17"/>
+              </w:rPr>
+              <w:t xml:space="preserve">必填 Required</w:t>
+            </w:r>
+          </w:p>
+        </w:tc>
+      </w:tr>
+      <w:tr>
+        <w:trPr>
+          <w:cantSplit/>
+        </w:trPr>
+        <w:tc>
+          <w:tcPr>
+            <w:tcW w:type="dxa" w:w="950"/>
+            <w:tcBorders>
+              <w:top w:val="single" w:color="D1D5DB" w:sz="4"/>
+              <w:left w:val="single" w:color="D1D5DB" w:sz="4"/>
+              <w:bottom w:val="single" w:color="D1D5DB" w:sz="4"/>
+              <w:right w:val="single" w:color="D1D5DB" w:sz="4"/>
+            </w:tcBorders>
+            <w:tcMar>
+              <w:top w:type="dxa" w:w="80"/>
+              <w:left w:type="dxa" w:w="110"/>
+              <w:bottom w:type="dxa" w:w="80"/>
+              <w:right w:type="dxa" w:w="110"/>
+            </w:tcMar>
+            <w:vAlign w:val="top"/>
+          </w:tcPr>
+          <w:p>
+            <w:pPr>
+              <w:spacing w:after="40" w:before="0"/>
+            </w:pPr>
+            <w:r>
+              <w:rPr>
+                <w:rFonts w:ascii="Arial" w:cs="Arial" w:eastAsia="Microsoft YaHei" w:hAnsi="Arial"/>
+                <w:b/>
+                <w:bCs/>
+                <w:color w:val="E8590C"/>
+                <w:sz w:val="17"/>
+                <w:szCs w:val="17"/>
+              </w:rPr>
+              <w:t xml:space="preserve">E-22</w:t>
+            </w:r>
+          </w:p>
+        </w:tc>
+        <w:tc>
+          <w:tcPr>
+            <w:tcW w:type="dxa" w:w="2700"/>
+            <w:tcBorders>
+              <w:top w:val="single" w:color="D1D5DB" w:sz="4"/>
+              <w:left w:val="single" w:color="D1D5DB" w:sz="4"/>
+              <w:bottom w:val="single" w:color="D1D5DB" w:sz="4"/>
+              <w:right w:val="single" w:color="D1D5DB" w:sz="4"/>
+            </w:tcBorders>
+            <w:tcMar>
+              <w:top w:type="dxa" w:w="80"/>
+              <w:left w:type="dxa" w:w="110"/>
+              <w:bottom w:type="dxa" w:w="80"/>
+              <w:right w:type="dxa" w:w="110"/>
+            </w:tcMar>
+            <w:vAlign w:val="top"/>
+          </w:tcPr>
+          <w:p>
+            <w:pPr>
+              <w:spacing w:after="40" w:before="0"/>
+            </w:pPr>
+            <w:r>
+              <w:rPr>
+                <w:rFonts w:ascii="Arial" w:cs="Arial" w:eastAsia="Microsoft YaHei" w:hAnsi="Arial"/>
+                <w:sz w:val="18"/>
+                <w:szCs w:val="18"/>
+              </w:rPr>
+              <w:t xml:space="preserve">地址 Address</w:t>
+            </w:r>
+          </w:p>
+        </w:tc>
+        <w:tc>
+          <w:tcPr>
+            <w:tcW w:type="dxa" w:w="4550"/>
+            <w:tcBorders>
+              <w:top w:val="single" w:color="D1D5DB" w:sz="4"/>
+              <w:left w:val="single" w:color="D1D5DB" w:sz="4"/>
+              <w:bottom w:val="single" w:color="D1D5DB" w:sz="4"/>
+              <w:right w:val="single" w:color="D1D5DB" w:sz="4"/>
+            </w:tcBorders>
+            <w:tcMar>
+              <w:top w:type="dxa" w:w="80"/>
+              <w:left w:type="dxa" w:w="110"/>
+              <w:bottom w:type="dxa" w:w="80"/>
+              <w:right w:type="dxa" w:w="110"/>
+            </w:tcMar>
+            <w:vAlign w:val="top"/>
+          </w:tcPr>
+          <w:p>
+            <w:pPr>
+              <w:spacing w:after="40" w:before="0"/>
+            </w:pPr>
+            <w:r>
+              <w:rPr>
+                <w:rFonts w:ascii="Arial" w:cs="Arial" w:eastAsia="Microsoft YaHei" w:hAnsi="Arial"/>
+                <w:i w:val="false"/>
+                <w:iCs w:val="false"/>
+                <w:color w:val="1F2328"/>
+                <w:sz w:val="19"/>
+                <w:szCs w:val="19"/>
+              </w:rPr>
+              <w:t xml:space="preserve">Address coming soon（占位）</w:t>
+            </w:r>
+          </w:p>
+        </w:tc>
+        <w:tc>
+          <w:tcPr>
+            <w:tcW w:type="dxa" w:w="5238"/>
+            <w:tcBorders>
+              <w:top w:val="single" w:color="D1D5DB" w:sz="4"/>
+              <w:left w:val="single" w:color="D1D5DB" w:sz="4"/>
+              <w:bottom w:val="single" w:color="D1D5DB" w:sz="4"/>
+              <w:right w:val="single" w:color="D1D5DB" w:sz="4"/>
+            </w:tcBorders>
+            <w:shd w:fill="FFF8E7" w:color="auto" w:val="clear"/>
+            <w:tcMar>
+              <w:top w:type="dxa" w:w="80"/>
+              <w:left w:type="dxa" w:w="110"/>
+              <w:bottom w:type="dxa" w:w="80"/>
+              <w:right w:type="dxa" w:w="110"/>
+            </w:tcMar>
+            <w:vAlign w:val="top"/>
+          </w:tcPr>
+          <w:p>
+            <w:pPr>
+              <w:spacing w:after="40" w:before="0"/>
+            </w:pPr>
+            <w:r>
+              <w:rPr>
+                <w:rFonts w:ascii="Arial" w:cs="Arial" w:eastAsia="Microsoft YaHei" w:hAnsi="Arial"/>
+                <w:b/>
+                <w:bCs/>
+                <w:color w:val="E8590C"/>
+                <w:sz w:val="17"/>
+                <w:szCs w:val="17"/>
+              </w:rPr>
+              <w:t xml:space="preserve">【请填写】</w:t>
+            </w:r>
+            <w:r>
+              <w:rPr>
+                <w:rFonts w:ascii="Arial" w:cs="Arial" w:eastAsia="Microsoft YaHei" w:hAnsi="Arial"/>
+                <w:color w:val="1D4ED8"/>
+                <w:sz w:val="19"/>
+                <w:szCs w:val="19"/>
+              </w:rPr>
+              <w:t xml:space="preserve">Street address, City, State ZIP</w:t>
+            </w:r>
+          </w:p>
+        </w:tc>
+        <w:tc>
+          <w:tcPr>
+            <w:tcW w:type="dxa" w:w="1400"/>
+            <w:tcBorders>
+              <w:top w:val="single" w:color="D1D5DB" w:sz="4"/>
+              <w:left w:val="single" w:color="D1D5DB" w:sz="4"/>
+              <w:bottom w:val="single" w:color="D1D5DB" w:sz="4"/>
+              <w:right w:val="single" w:color="D1D5DB" w:sz="4"/>
+            </w:tcBorders>
+            <w:shd w:fill="FDE8E8" w:color="auto" w:val="clear"/>
+            <w:tcMar>
+              <w:top w:type="dxa" w:w="80"/>
+              <w:left w:type="dxa" w:w="110"/>
+              <w:bottom w:type="dxa" w:w="80"/>
+              <w:right w:type="dxa" w:w="110"/>
+            </w:tcMar>
+            <w:vAlign w:val="top"/>
+          </w:tcPr>
+          <w:p>
+            <w:pPr>
+              <w:spacing w:after="40" w:before="0"/>
+            </w:pPr>
+            <w:r>
+              <w:rPr>
+                <w:rFonts w:ascii="Arial" w:cs="Arial" w:eastAsia="Microsoft YaHei" w:hAnsi="Arial"/>
+                <w:b/>
+                <w:bCs/>
+                <w:color w:val="B91C1C"/>
+                <w:sz w:val="17"/>
+                <w:szCs w:val="17"/>
+              </w:rPr>
+              <w:t xml:space="preserve">必填 Required</w:t>
+            </w:r>
+          </w:p>
+        </w:tc>
+      </w:tr>
+      <w:tr>
+        <w:trPr>
+          <w:cantSplit/>
+        </w:trPr>
+        <w:tc>
+          <w:tcPr>
+            <w:tcW w:type="dxa" w:w="950"/>
+            <w:tcBorders>
+              <w:top w:val="single" w:color="D1D5DB" w:sz="4"/>
+              <w:left w:val="single" w:color="D1D5DB" w:sz="4"/>
+              <w:bottom w:val="single" w:color="D1D5DB" w:sz="4"/>
+              <w:right w:val="single" w:color="D1D5DB" w:sz="4"/>
+            </w:tcBorders>
+            <w:tcMar>
+              <w:top w:type="dxa" w:w="80"/>
+              <w:left w:type="dxa" w:w="110"/>
+              <w:bottom w:type="dxa" w:w="80"/>
+              <w:right w:type="dxa" w:w="110"/>
+            </w:tcMar>
+            <w:vAlign w:val="top"/>
+          </w:tcPr>
+          <w:p>
+            <w:pPr>
+              <w:spacing w:after="40" w:before="0"/>
+            </w:pPr>
+            <w:r>
+              <w:rPr>
+                <w:rFonts w:ascii="Arial" w:cs="Arial" w:eastAsia="Microsoft YaHei" w:hAnsi="Arial"/>
+                <w:b/>
+                <w:bCs/>
+                <w:color w:val="E8590C"/>
+                <w:sz w:val="17"/>
+                <w:szCs w:val="17"/>
+              </w:rPr>
+              <w:t xml:space="preserve">E-23</w:t>
+            </w:r>
+          </w:p>
+        </w:tc>
+        <w:tc>
+          <w:tcPr>
+            <w:tcW w:type="dxa" w:w="2700"/>
+            <w:tcBorders>
+              <w:top w:val="single" w:color="D1D5DB" w:sz="4"/>
+              <w:left w:val="single" w:color="D1D5DB" w:sz="4"/>
+              <w:bottom w:val="single" w:color="D1D5DB" w:sz="4"/>
+              <w:right w:val="single" w:color="D1D5DB" w:sz="4"/>
+            </w:tcBorders>
+            <w:tcMar>
+              <w:top w:type="dxa" w:w="80"/>
+              <w:left w:type="dxa" w:w="110"/>
+              <w:bottom w:type="dxa" w:w="80"/>
+              <w:right w:type="dxa" w:w="110"/>
+            </w:tcMar>
+            <w:vAlign w:val="top"/>
+          </w:tcPr>
+          <w:p>
+            <w:pPr>
+              <w:spacing w:after="40" w:before="0"/>
+            </w:pPr>
+            <w:r>
+              <w:rPr>
+                <w:rFonts w:ascii="Arial" w:cs="Arial" w:eastAsia="Microsoft YaHei" w:hAnsi="Arial"/>
+                <w:sz w:val="18"/>
+                <w:szCs w:val="18"/>
+              </w:rPr>
+              <w:t xml:space="preserve">训练时间 Training hours</w:t>
+            </w:r>
+          </w:p>
+        </w:tc>
+        <w:tc>
+          <w:tcPr>
+            <w:tcW w:type="dxa" w:w="4550"/>
+            <w:tcBorders>
+              <w:top w:val="single" w:color="D1D5DB" w:sz="4"/>
+              <w:left w:val="single" w:color="D1D5DB" w:sz="4"/>
+              <w:bottom w:val="single" w:color="D1D5DB" w:sz="4"/>
+              <w:right w:val="single" w:color="D1D5DB" w:sz="4"/>
+            </w:tcBorders>
+            <w:tcMar>
+              <w:top w:type="dxa" w:w="80"/>
+              <w:left w:type="dxa" w:w="110"/>
+              <w:bottom w:type="dxa" w:w="80"/>
+              <w:right w:type="dxa" w:w="110"/>
+            </w:tcMar>
+            <w:vAlign w:val="top"/>
+          </w:tcPr>
+          <w:p>
+            <w:pPr>
+              <w:spacing w:after="40" w:before="0"/>
+            </w:pPr>
+            <w:r>
+              <w:rPr>
+                <w:rFonts w:ascii="Arial" w:cs="Arial" w:eastAsia="Microsoft YaHei" w:hAnsi="Arial"/>
+                <w:i w:val="false"/>
+                <w:iCs w:val="false"/>
+                <w:color w:val="1F2328"/>
+                <w:sz w:val="19"/>
+                <w:szCs w:val="19"/>
+              </w:rPr>
+              <w:t xml:space="preserve">Schedule coming soon（占位）</w:t>
+            </w:r>
+          </w:p>
+          <w:p>
+            <w:pPr>
+              <w:spacing w:after="40" w:before="0"/>
+            </w:pPr>
+            <w:r>
+              <w:rPr>
+                <w:rFonts w:ascii="Arial" w:cs="Arial" w:eastAsia="Microsoft YaHei" w:hAnsi="Arial"/>
+                <w:i/>
+                <w:iCs/>
+                <w:color w:val="6B7280"/>
+                <w:sz w:val="16"/>
+                <w:szCs w:val="16"/>
+              </w:rPr>
+              <w:t xml:space="preserve">说明：可写该校区开设的课程，如 “Volleyball · Mon/Wed 5–7 pm”。</w:t>
+            </w:r>
+          </w:p>
+        </w:tc>
+        <w:tc>
+          <w:tcPr>
+            <w:tcW w:type="dxa" w:w="5238"/>
+            <w:tcBorders>
+              <w:top w:val="single" w:color="D1D5DB" w:sz="4"/>
+              <w:left w:val="single" w:color="D1D5DB" w:sz="4"/>
+              <w:bottom w:val="single" w:color="D1D5DB" w:sz="4"/>
+              <w:right w:val="single" w:color="D1D5DB" w:sz="4"/>
+            </w:tcBorders>
+            <w:shd w:fill="FFF8E7" w:color="auto" w:val="clear"/>
+            <w:tcMar>
+              <w:top w:type="dxa" w:w="80"/>
+              <w:left w:type="dxa" w:w="110"/>
+              <w:bottom w:type="dxa" w:w="80"/>
+              <w:right w:type="dxa" w:w="110"/>
+            </w:tcMar>
+            <w:vAlign w:val="top"/>
+          </w:tcPr>
+          <w:p>
+            <w:pPr>
+              <w:spacing w:after="40" w:before="0"/>
+            </w:pPr>
+            <w:r>
+              <w:rPr>
+                <w:rFonts w:ascii="Arial" w:cs="Arial" w:eastAsia="Microsoft YaHei" w:hAnsi="Arial"/>
+                <w:b/>
+                <w:bCs/>
+                <w:color w:val="E8590C"/>
+                <w:sz w:val="17"/>
+                <w:szCs w:val="17"/>
+              </w:rPr>
+              <w:t xml:space="preserve">【示例】</w:t>
+            </w:r>
+            <w:r>
+              <w:rPr>
+                <w:rFonts w:ascii="Arial" w:cs="Arial" w:eastAsia="Microsoft YaHei" w:hAnsi="Arial"/>
+                <w:color w:val="1D4ED8"/>
+                <w:sz w:val="19"/>
+                <w:szCs w:val="19"/>
+              </w:rPr>
+              <w:t xml:space="preserve">Mon–Fri 4–8 pm · Sat 9 am–3 pm</w:t>
+            </w:r>
+          </w:p>
+        </w:tc>
+        <w:tc>
+          <w:tcPr>
+            <w:tcW w:type="dxa" w:w="1400"/>
+            <w:tcBorders>
+              <w:top w:val="single" w:color="D1D5DB" w:sz="4"/>
+              <w:left w:val="single" w:color="D1D5DB" w:sz="4"/>
+              <w:bottom w:val="single" w:color="D1D5DB" w:sz="4"/>
+              <w:right w:val="single" w:color="D1D5DB" w:sz="4"/>
+            </w:tcBorders>
+            <w:shd w:fill="FDE8E8" w:color="auto" w:val="clear"/>
+            <w:tcMar>
+              <w:top w:type="dxa" w:w="80"/>
+              <w:left w:type="dxa" w:w="110"/>
+              <w:bottom w:type="dxa" w:w="80"/>
+              <w:right w:type="dxa" w:w="110"/>
+            </w:tcMar>
+            <w:vAlign w:val="top"/>
+          </w:tcPr>
+          <w:p>
+            <w:pPr>
+              <w:spacing w:after="40" w:before="0"/>
+            </w:pPr>
+            <w:r>
+              <w:rPr>
+                <w:rFonts w:ascii="Arial" w:cs="Arial" w:eastAsia="Microsoft YaHei" w:hAnsi="Arial"/>
+                <w:b/>
+                <w:bCs/>
+                <w:color w:val="B91C1C"/>
+                <w:sz w:val="17"/>
+                <w:szCs w:val="17"/>
+              </w:rPr>
+              <w:t xml:space="preserve">必填 Required</w:t>
+            </w:r>
+          </w:p>
+        </w:tc>
+      </w:tr>
+      <w:tr>
+        <w:trPr>
+          <w:cantSplit/>
+        </w:trPr>
+        <w:tc>
+          <w:tcPr>
+            <w:tcW w:type="dxa" w:w="950"/>
+            <w:tcBorders>
+              <w:top w:val="single" w:color="D1D5DB" w:sz="4"/>
+              <w:left w:val="single" w:color="D1D5DB" w:sz="4"/>
+              <w:bottom w:val="single" w:color="D1D5DB" w:sz="4"/>
+              <w:right w:val="single" w:color="D1D5DB" w:sz="4"/>
+            </w:tcBorders>
+            <w:tcMar>
+              <w:top w:type="dxa" w:w="80"/>
+              <w:left w:type="dxa" w:w="110"/>
+              <w:bottom w:type="dxa" w:w="80"/>
+              <w:right w:type="dxa" w:w="110"/>
+            </w:tcMar>
+            <w:vAlign w:val="top"/>
+          </w:tcPr>
+          <w:p>
+            <w:pPr>
+              <w:spacing w:after="40" w:before="0"/>
+            </w:pPr>
+            <w:r>
+              <w:rPr>
+                <w:rFonts w:ascii="Arial" w:cs="Arial" w:eastAsia="Microsoft YaHei" w:hAnsi="Arial"/>
+                <w:b/>
+                <w:bCs/>
+                <w:color w:val="E8590C"/>
+                <w:sz w:val="17"/>
+                <w:szCs w:val="17"/>
+              </w:rPr>
+              <w:t xml:space="preserve">E-24</w:t>
+            </w:r>
+          </w:p>
+        </w:tc>
+        <w:tc>
+          <w:tcPr>
+            <w:tcW w:type="dxa" w:w="2700"/>
+            <w:tcBorders>
+              <w:top w:val="single" w:color="D1D5DB" w:sz="4"/>
+              <w:left w:val="single" w:color="D1D5DB" w:sz="4"/>
+              <w:bottom w:val="single" w:color="D1D5DB" w:sz="4"/>
+              <w:right w:val="single" w:color="D1D5DB" w:sz="4"/>
+            </w:tcBorders>
+            <w:tcMar>
+              <w:top w:type="dxa" w:w="80"/>
+              <w:left w:type="dxa" w:w="110"/>
+              <w:bottom w:type="dxa" w:w="80"/>
+              <w:right w:type="dxa" w:w="110"/>
+            </w:tcMar>
+            <w:vAlign w:val="top"/>
+          </w:tcPr>
+          <w:p>
+            <w:pPr>
+              <w:spacing w:after="40" w:before="0"/>
+            </w:pPr>
+            <w:r>
+              <w:rPr>
+                <w:rFonts w:ascii="Arial" w:cs="Arial" w:eastAsia="Microsoft YaHei" w:hAnsi="Arial"/>
+                <w:sz w:val="18"/>
+                <w:szCs w:val="18"/>
+              </w:rPr>
+              <w:t xml:space="preserve">地图链接 Google Maps link</w:t>
+            </w:r>
+          </w:p>
+        </w:tc>
+        <w:tc>
+          <w:tcPr>
+            <w:tcW w:type="dxa" w:w="4550"/>
+            <w:tcBorders>
+              <w:top w:val="single" w:color="D1D5DB" w:sz="4"/>
+              <w:left w:val="single" w:color="D1D5DB" w:sz="4"/>
+              <w:bottom w:val="single" w:color="D1D5DB" w:sz="4"/>
+              <w:right w:val="single" w:color="D1D5DB" w:sz="4"/>
+            </w:tcBorders>
+            <w:tcMar>
+              <w:top w:type="dxa" w:w="80"/>
+              <w:left w:type="dxa" w:w="110"/>
+              <w:bottom w:type="dxa" w:w="80"/>
+              <w:right w:type="dxa" w:w="110"/>
+            </w:tcMar>
+            <w:vAlign w:val="top"/>
+          </w:tcPr>
+          <w:p>
+            <w:pPr>
+              <w:spacing w:after="40" w:before="0"/>
+            </w:pPr>
+            <w:r>
+              <w:rPr>
+                <w:rFonts w:ascii="Arial" w:cs="Arial" w:eastAsia="Microsoft YaHei" w:hAnsi="Arial"/>
+                <w:i/>
+                <w:iCs/>
+                <w:color w:val="6B7280"/>
+                <w:sz w:val="19"/>
+                <w:szCs w:val="19"/>
+              </w:rPr>
+              <w:t xml:space="preserve">（目前未展示）</w:t>
+            </w:r>
+          </w:p>
+          <w:p>
+            <w:pPr>
+              <w:spacing w:after="40" w:before="0"/>
+            </w:pPr>
+            <w:r>
+              <w:rPr>
+                <w:rFonts w:ascii="Arial" w:cs="Arial" w:eastAsia="Microsoft YaHei" w:hAnsi="Arial"/>
+                <w:i/>
+                <w:iCs/>
+                <w:color w:val="6B7280"/>
+                <w:sz w:val="16"/>
+                <w:szCs w:val="16"/>
+              </w:rPr>
+              <w:t xml:space="preserve">说明：在 Google Maps 搜到场馆 → 分享 → 复制链接。提供后会显示 “Directions ↗” 按钮。</w:t>
+            </w:r>
+          </w:p>
+        </w:tc>
+        <w:tc>
+          <w:tcPr>
+            <w:tcW w:type="dxa" w:w="5238"/>
+            <w:tcBorders>
+              <w:top w:val="single" w:color="D1D5DB" w:sz="4"/>
+              <w:left w:val="single" w:color="D1D5DB" w:sz="4"/>
+              <w:bottom w:val="single" w:color="D1D5DB" w:sz="4"/>
+              <w:right w:val="single" w:color="D1D5DB" w:sz="4"/>
+            </w:tcBorders>
+            <w:shd w:fill="FFF8E7" w:color="auto" w:val="clear"/>
+            <w:tcMar>
+              <w:top w:type="dxa" w:w="80"/>
+              <w:left w:type="dxa" w:w="110"/>
+              <w:bottom w:type="dxa" w:w="80"/>
+              <w:right w:type="dxa" w:w="110"/>
+            </w:tcMar>
+            <w:vAlign w:val="top"/>
+          </w:tcPr>
+          <w:p>
+            <w:pPr>
+              <w:spacing w:after="40" w:before="0"/>
+            </w:pPr>
+            <w:r>
+              <w:rPr>
+                <w:rFonts w:ascii="Arial" w:cs="Arial" w:eastAsia="Microsoft YaHei" w:hAnsi="Arial"/>
+                <w:b/>
+                <w:bCs/>
+                <w:color w:val="E8590C"/>
+                <w:sz w:val="17"/>
+                <w:szCs w:val="17"/>
+              </w:rPr>
+              <w:t xml:space="preserve">【请填写】</w:t>
+            </w:r>
+            <w:r>
+              <w:rPr>
+                <w:rFonts w:ascii="Arial" w:cs="Arial" w:eastAsia="Microsoft YaHei" w:hAnsi="Arial"/>
+                <w:color w:val="1D4ED8"/>
+                <w:sz w:val="19"/>
+                <w:szCs w:val="19"/>
+              </w:rPr>
+              <w:t xml:space="preserve">https://maps.app.goo.gl/…</w:t>
+            </w:r>
+          </w:p>
+        </w:tc>
+        <w:tc>
+          <w:tcPr>
+            <w:tcW w:type="dxa" w:w="1400"/>
+            <w:tcBorders>
+              <w:top w:val="single" w:color="D1D5DB" w:sz="4"/>
+              <w:left w:val="single" w:color="D1D5DB" w:sz="4"/>
+              <w:bottom w:val="single" w:color="D1D5DB" w:sz="4"/>
+              <w:right w:val="single" w:color="D1D5DB" w:sz="4"/>
+            </w:tcBorders>
+            <w:shd w:fill="E0ECFF" w:color="auto" w:val="clear"/>
+            <w:tcMar>
+              <w:top w:type="dxa" w:w="80"/>
+              <w:left w:type="dxa" w:w="110"/>
+              <w:bottom w:type="dxa" w:w="80"/>
+              <w:right w:type="dxa" w:w="110"/>
+            </w:tcMar>
+            <w:vAlign w:val="top"/>
+          </w:tcPr>
+          <w:p>
+            <w:pPr>
+              <w:spacing w:after="40" w:before="0"/>
+            </w:pPr>
+            <w:r>
+              <w:rPr>
+                <w:rFonts w:ascii="Arial" w:cs="Arial" w:eastAsia="Microsoft YaHei" w:hAnsi="Arial"/>
+                <w:b/>
+                <w:bCs/>
+                <w:color w:val="1D4ED8"/>
+                <w:sz w:val="17"/>
+                <w:szCs w:val="17"/>
+              </w:rPr>
+              <w:t xml:space="preserve">新增 New</w:t>
+            </w:r>
+          </w:p>
+        </w:tc>
+      </w:tr>
+    </w:tbl>
+    <w:p>
+      <w:pPr>
+        <w:spacing w:after="60"/>
+      </w:pPr>
+    </w:p>
+    <w:p>
+      <w:pPr>
+        <w:spacing w:after="80" w:before="0"/>
+      </w:pPr>
+      <w:r>
+        <w:rPr>
+          <w:rFonts w:ascii="Arial" w:cs="Arial" w:eastAsia="Microsoft YaHei" w:hAnsi="Arial"/>
+          <w:b/>
+          <w:bCs/>
+          <w:color w:val="1F2328"/>
+          <w:sz w:val="20"/>
+          <w:szCs w:val="20"/>
+        </w:rPr>
+        <w:t xml:space="preserve">校区 03  Campus 03</w:t>
+      </w:r>
+    </w:p>
+    <w:tbl>
+      <w:tblPr>
+        <w:tblW w:type="dxa" w:w="14838"/>
+        <w:tblBorders>
+          <w:top w:val="single" w:color="auto" w:sz="4"/>
+          <w:left w:val="single" w:color="auto" w:sz="4"/>
+          <w:bottom w:val="single" w:color="auto" w:sz="4"/>
+          <w:right w:val="single" w:color="auto" w:sz="4"/>
+          <w:insideH w:val="single" w:color="auto" w:sz="4"/>
+          <w:insideV w:val="single" w:color="auto" w:sz="4"/>
+        </w:tblBorders>
+        <w:tblLayout w:type="fixed"/>
+      </w:tblPr>
+      <w:tblGrid>
+        <w:gridCol w:w="950"/>
+        <w:gridCol w:w="2700"/>
+        <w:gridCol w:w="4550"/>
+        <w:gridCol w:w="5238"/>
+        <w:gridCol w:w="1400"/>
+      </w:tblGrid>
+      <w:tr>
+        <w:trPr>
+          <w:tblHeader/>
+        </w:trPr>
+        <w:tc>
+          <w:tcPr>
+            <w:tcW w:type="dxa" w:w="950"/>
+            <w:tcBorders>
+              <w:top w:val="single" w:color="D1D5DB" w:sz="4"/>
+              <w:left w:val="single" w:color="D1D5DB" w:sz="4"/>
+              <w:bottom w:val="single" w:color="D1D5DB" w:sz="4"/>
+              <w:right w:val="single" w:color="D1D5DB" w:sz="4"/>
+            </w:tcBorders>
+            <w:shd w:fill="1F2328" w:color="auto" w:val="clear"/>
+            <w:tcMar>
+              <w:top w:type="dxa" w:w="80"/>
+              <w:left w:type="dxa" w:w="110"/>
+              <w:bottom w:type="dxa" w:w="80"/>
+              <w:right w:type="dxa" w:w="110"/>
+            </w:tcMar>
+            <w:vAlign w:val="center"/>
+          </w:tcPr>
+          <w:p>
+            <w:pPr>
+              <w:spacing w:after="40" w:before="0"/>
+            </w:pPr>
+            <w:r>
+              <w:rPr>
+                <w:rFonts w:ascii="Arial" w:cs="Arial" w:eastAsia="Microsoft YaHei" w:hAnsi="Arial"/>
+                <w:b/>
+                <w:bCs/>
+                <w:color w:val="FFFFFF"/>
+                <w:sz w:val="18"/>
+                <w:szCs w:val="18"/>
+              </w:rPr>
+              <w:t xml:space="preserve">编号 ID</w:t>
+            </w:r>
+          </w:p>
+        </w:tc>
+        <w:tc>
+          <w:tcPr>
+            <w:tcW w:type="dxa" w:w="2700"/>
+            <w:tcBorders>
+              <w:top w:val="single" w:color="D1D5DB" w:sz="4"/>
+              <w:left w:val="single" w:color="D1D5DB" w:sz="4"/>
+              <w:bottom w:val="single" w:color="D1D5DB" w:sz="4"/>
+              <w:right w:val="single" w:color="D1D5DB" w:sz="4"/>
+            </w:tcBorders>
+            <w:shd w:fill="1F2328" w:color="auto" w:val="clear"/>
+            <w:tcMar>
+              <w:top w:type="dxa" w:w="80"/>
+              <w:left w:type="dxa" w:w="110"/>
+              <w:bottom w:type="dxa" w:w="80"/>
+              <w:right w:type="dxa" w:w="110"/>
+            </w:tcMar>
+            <w:vAlign w:val="center"/>
+          </w:tcPr>
+          <w:p>
+            <w:pPr>
+              <w:spacing w:after="40" w:before="0"/>
+            </w:pPr>
+            <w:r>
+              <w:rPr>
+                <w:rFonts w:ascii="Arial" w:cs="Arial" w:eastAsia="Microsoft YaHei" w:hAnsi="Arial"/>
+                <w:b/>
+                <w:bCs/>
+                <w:color w:val="FFFFFF"/>
+                <w:sz w:val="18"/>
+                <w:szCs w:val="18"/>
+              </w:rPr>
+              <w:t xml:space="preserve">位置 / 字段  Location</w:t>
+            </w:r>
+          </w:p>
+        </w:tc>
+        <w:tc>
+          <w:tcPr>
+            <w:tcW w:type="dxa" w:w="4550"/>
+            <w:tcBorders>
+              <w:top w:val="single" w:color="D1D5DB" w:sz="4"/>
+              <w:left w:val="single" w:color="D1D5DB" w:sz="4"/>
+              <w:bottom w:val="single" w:color="D1D5DB" w:sz="4"/>
+              <w:right w:val="single" w:color="D1D5DB" w:sz="4"/>
+            </w:tcBorders>
+            <w:shd w:fill="1F2328" w:color="auto" w:val="clear"/>
+            <w:tcMar>
+              <w:top w:type="dxa" w:w="80"/>
+              <w:left w:type="dxa" w:w="110"/>
+              <w:bottom w:type="dxa" w:w="80"/>
+              <w:right w:type="dxa" w:w="110"/>
+            </w:tcMar>
+            <w:vAlign w:val="center"/>
+          </w:tcPr>
+          <w:p>
+            <w:pPr>
+              <w:spacing w:after="40" w:before="0"/>
+            </w:pPr>
+            <w:r>
+              <w:rPr>
+                <w:rFonts w:ascii="Arial" w:cs="Arial" w:eastAsia="Microsoft YaHei" w:hAnsi="Arial"/>
+                <w:b/>
+                <w:bCs/>
+                <w:color w:val="FFFFFF"/>
+                <w:sz w:val="18"/>
+                <w:szCs w:val="18"/>
+              </w:rPr>
+              <w:t xml:space="preserve">当前内容  Current text</w:t>
+            </w:r>
+          </w:p>
+        </w:tc>
+        <w:tc>
+          <w:tcPr>
+            <w:tcW w:type="dxa" w:w="5238"/>
+            <w:tcBorders>
+              <w:top w:val="single" w:color="D1D5DB" w:sz="4"/>
+              <w:left w:val="single" w:color="D1D5DB" w:sz="4"/>
+              <w:bottom w:val="single" w:color="D1D5DB" w:sz="4"/>
+              <w:right w:val="single" w:color="D1D5DB" w:sz="4"/>
+            </w:tcBorders>
+            <w:shd w:fill="1F2328" w:color="auto" w:val="clear"/>
+            <w:tcMar>
+              <w:top w:type="dxa" w:w="80"/>
+              <w:left w:type="dxa" w:w="110"/>
+              <w:bottom w:type="dxa" w:w="80"/>
+              <w:right w:type="dxa" w:w="110"/>
+            </w:tcMar>
+            <w:vAlign w:val="center"/>
+          </w:tcPr>
+          <w:p>
+            <w:pPr>
+              <w:spacing w:after="40" w:before="0"/>
+            </w:pPr>
+            <w:r>
+              <w:rPr>
+                <w:rFonts w:ascii="Arial" w:cs="Arial" w:eastAsia="Microsoft YaHei" w:hAnsi="Arial"/>
+                <w:b/>
+                <w:bCs/>
+                <w:color w:val="FFFFFF"/>
+                <w:sz w:val="18"/>
+                <w:szCs w:val="18"/>
+              </w:rPr>
+              <w:t xml:space="preserve">新内容（客户填写）  New text</w:t>
+            </w:r>
+          </w:p>
+        </w:tc>
+        <w:tc>
+          <w:tcPr>
+            <w:tcW w:type="dxa" w:w="1400"/>
+            <w:tcBorders>
+              <w:top w:val="single" w:color="D1D5DB" w:sz="4"/>
+              <w:left w:val="single" w:color="D1D5DB" w:sz="4"/>
+              <w:bottom w:val="single" w:color="D1D5DB" w:sz="4"/>
+              <w:right w:val="single" w:color="D1D5DB" w:sz="4"/>
+            </w:tcBorders>
+            <w:shd w:fill="1F2328" w:color="auto" w:val="clear"/>
+            <w:tcMar>
+              <w:top w:type="dxa" w:w="80"/>
+              <w:left w:type="dxa" w:w="110"/>
+              <w:bottom w:type="dxa" w:w="80"/>
+              <w:right w:type="dxa" w:w="110"/>
+            </w:tcMar>
+            <w:vAlign w:val="center"/>
+          </w:tcPr>
+          <w:p>
+            <w:pPr>
+              <w:spacing w:after="40" w:before="0"/>
+            </w:pPr>
+            <w:r>
+              <w:rPr>
+                <w:rFonts w:ascii="Arial" w:cs="Arial" w:eastAsia="Microsoft YaHei" w:hAnsi="Arial"/>
+                <w:b/>
+                <w:bCs/>
+                <w:color w:val="FFFFFF"/>
+                <w:sz w:val="18"/>
+                <w:szCs w:val="18"/>
+              </w:rPr>
+              <w:t xml:space="preserve">优先级</w:t>
+            </w:r>
+          </w:p>
+        </w:tc>
+      </w:tr>
+      <w:tr>
+        <w:trPr>
+          <w:cantSplit/>
+        </w:trPr>
+        <w:tc>
+          <w:tcPr>
+            <w:tcW w:type="dxa" w:w="950"/>
+            <w:tcBorders>
+              <w:top w:val="single" w:color="D1D5DB" w:sz="4"/>
+              <w:left w:val="single" w:color="D1D5DB" w:sz="4"/>
+              <w:bottom w:val="single" w:color="D1D5DB" w:sz="4"/>
+              <w:right w:val="single" w:color="D1D5DB" w:sz="4"/>
+            </w:tcBorders>
+            <w:tcMar>
+              <w:top w:type="dxa" w:w="80"/>
+              <w:left w:type="dxa" w:w="110"/>
+              <w:bottom w:type="dxa" w:w="80"/>
+              <w:right w:type="dxa" w:w="110"/>
+            </w:tcMar>
+            <w:vAlign w:val="top"/>
+          </w:tcPr>
+          <w:p>
+            <w:pPr>
+              <w:spacing w:after="40" w:before="0"/>
+            </w:pPr>
+            <w:r>
+              <w:rPr>
+                <w:rFonts w:ascii="Arial" w:cs="Arial" w:eastAsia="Microsoft YaHei" w:hAnsi="Arial"/>
+                <w:b/>
+                <w:bCs/>
+                <w:color w:val="E8590C"/>
+                <w:sz w:val="17"/>
+                <w:szCs w:val="17"/>
+              </w:rPr>
+              <w:t xml:space="preserve">E-31</w:t>
+            </w:r>
+          </w:p>
+        </w:tc>
+        <w:tc>
+          <w:tcPr>
+            <w:tcW w:type="dxa" w:w="2700"/>
+            <w:tcBorders>
+              <w:top w:val="single" w:color="D1D5DB" w:sz="4"/>
+              <w:left w:val="single" w:color="D1D5DB" w:sz="4"/>
+              <w:bottom w:val="single" w:color="D1D5DB" w:sz="4"/>
+              <w:right w:val="single" w:color="D1D5DB" w:sz="4"/>
+            </w:tcBorders>
+            <w:tcMar>
+              <w:top w:type="dxa" w:w="80"/>
+              <w:left w:type="dxa" w:w="110"/>
+              <w:bottom w:type="dxa" w:w="80"/>
+              <w:right w:type="dxa" w:w="110"/>
+            </w:tcMar>
+            <w:vAlign w:val="top"/>
+          </w:tcPr>
+          <w:p>
+            <w:pPr>
+              <w:spacing w:after="40" w:before="0"/>
+            </w:pPr>
+            <w:r>
+              <w:rPr>
+                <w:rFonts w:ascii="Arial" w:cs="Arial" w:eastAsia="Microsoft YaHei" w:hAnsi="Arial"/>
+                <w:sz w:val="18"/>
+                <w:szCs w:val="18"/>
+              </w:rPr>
+              <w:t xml:space="preserve">校区名称 Campus name</w:t>
+            </w:r>
+          </w:p>
+        </w:tc>
+        <w:tc>
+          <w:tcPr>
+            <w:tcW w:type="dxa" w:w="4550"/>
+            <w:tcBorders>
+              <w:top w:val="single" w:color="D1D5DB" w:sz="4"/>
+              <w:left w:val="single" w:color="D1D5DB" w:sz="4"/>
+              <w:bottom w:val="single" w:color="D1D5DB" w:sz="4"/>
+              <w:right w:val="single" w:color="D1D5DB" w:sz="4"/>
+            </w:tcBorders>
+            <w:tcMar>
+              <w:top w:type="dxa" w:w="80"/>
+              <w:left w:type="dxa" w:w="110"/>
+              <w:bottom w:type="dxa" w:w="80"/>
+              <w:right w:type="dxa" w:w="110"/>
+            </w:tcMar>
+            <w:vAlign w:val="top"/>
+          </w:tcPr>
+          <w:p>
+            <w:pPr>
+              <w:spacing w:after="40" w:before="0"/>
+            </w:pPr>
+            <w:r>
+              <w:rPr>
+                <w:rFonts w:ascii="Arial" w:cs="Arial" w:eastAsia="Microsoft YaHei" w:hAnsi="Arial"/>
+                <w:i w:val="false"/>
+                <w:iCs w:val="false"/>
+                <w:color w:val="1F2328"/>
+                <w:sz w:val="19"/>
+                <w:szCs w:val="19"/>
+              </w:rPr>
+              <w:t xml:space="preserve">Campus name coming soon（占位）</w:t>
+            </w:r>
+          </w:p>
+          <w:p>
+            <w:pPr>
+              <w:spacing w:after="40" w:before="0"/>
+            </w:pPr>
+            <w:r>
+              <w:rPr>
+                <w:rFonts w:ascii="Arial" w:cs="Arial" w:eastAsia="Microsoft YaHei" w:hAnsi="Arial"/>
+                <w:i/>
+                <w:iCs/>
+                <w:color w:val="6B7280"/>
+                <w:sz w:val="16"/>
+                <w:szCs w:val="16"/>
+              </w:rPr>
+              <w:t xml:space="preserve">说明：例如 “Irvine Campus” 或场馆名称。</w:t>
+            </w:r>
+          </w:p>
+        </w:tc>
+        <w:tc>
+          <w:tcPr>
+            <w:tcW w:type="dxa" w:w="5238"/>
+            <w:tcBorders>
+              <w:top w:val="single" w:color="D1D5DB" w:sz="4"/>
+              <w:left w:val="single" w:color="D1D5DB" w:sz="4"/>
+              <w:bottom w:val="single" w:color="D1D5DB" w:sz="4"/>
+              <w:right w:val="single" w:color="D1D5DB" w:sz="4"/>
+            </w:tcBorders>
+            <w:shd w:fill="FFF8E7" w:color="auto" w:val="clear"/>
+            <w:tcMar>
+              <w:top w:type="dxa" w:w="80"/>
+              <w:left w:type="dxa" w:w="110"/>
+              <w:bottom w:type="dxa" w:w="80"/>
+              <w:right w:type="dxa" w:w="110"/>
+            </w:tcMar>
+            <w:vAlign w:val="top"/>
+          </w:tcPr>
+          <w:p>
+            <w:pPr>
+              <w:spacing w:after="40" w:before="0"/>
+            </w:pPr>
+            <w:r>
+              <w:rPr>
+                <w:rFonts w:ascii="Arial" w:cs="Arial" w:eastAsia="Microsoft YaHei" w:hAnsi="Arial"/>
+                <w:b/>
+                <w:bCs/>
+                <w:color w:val="E8590C"/>
+                <w:sz w:val="17"/>
+                <w:szCs w:val="17"/>
+              </w:rPr>
+              <w:t xml:space="preserve">【请填写】</w:t>
+            </w:r>
+            <w:r>
+              <w:rPr>
+                <w:rFonts w:ascii="Arial" w:cs="Arial" w:eastAsia="Microsoft YaHei" w:hAnsi="Arial"/>
+                <w:color w:val="1D4ED8"/>
+                <w:sz w:val="19"/>
+                <w:szCs w:val="19"/>
+              </w:rPr>
+              <w:t xml:space="preserve">___ Campus</w:t>
+            </w:r>
+          </w:p>
+        </w:tc>
+        <w:tc>
+          <w:tcPr>
+            <w:tcW w:type="dxa" w:w="1400"/>
+            <w:tcBorders>
+              <w:top w:val="single" w:color="D1D5DB" w:sz="4"/>
+              <w:left w:val="single" w:color="D1D5DB" w:sz="4"/>
+              <w:bottom w:val="single" w:color="D1D5DB" w:sz="4"/>
+              <w:right w:val="single" w:color="D1D5DB" w:sz="4"/>
+            </w:tcBorders>
+            <w:shd w:fill="FDE8E8" w:color="auto" w:val="clear"/>
+            <w:tcMar>
+              <w:top w:type="dxa" w:w="80"/>
+              <w:left w:type="dxa" w:w="110"/>
+              <w:bottom w:type="dxa" w:w="80"/>
+              <w:right w:type="dxa" w:w="110"/>
+            </w:tcMar>
+            <w:vAlign w:val="top"/>
+          </w:tcPr>
+          <w:p>
+            <w:pPr>
+              <w:spacing w:after="40" w:before="0"/>
+            </w:pPr>
+            <w:r>
+              <w:rPr>
+                <w:rFonts w:ascii="Arial" w:cs="Arial" w:eastAsia="Microsoft YaHei" w:hAnsi="Arial"/>
+                <w:b/>
+                <w:bCs/>
+                <w:color w:val="B91C1C"/>
+                <w:sz w:val="17"/>
+                <w:szCs w:val="17"/>
+              </w:rPr>
+              <w:t xml:space="preserve">必填 Required</w:t>
+            </w:r>
+          </w:p>
+        </w:tc>
+      </w:tr>
+      <w:tr>
+        <w:trPr>
+          <w:cantSplit/>
+        </w:trPr>
+        <w:tc>
+          <w:tcPr>
+            <w:tcW w:type="dxa" w:w="950"/>
+            <w:tcBorders>
+              <w:top w:val="single" w:color="D1D5DB" w:sz="4"/>
+              <w:left w:val="single" w:color="D1D5DB" w:sz="4"/>
+              <w:bottom w:val="single" w:color="D1D5DB" w:sz="4"/>
+              <w:right w:val="single" w:color="D1D5DB" w:sz="4"/>
+            </w:tcBorders>
+            <w:tcMar>
+              <w:top w:type="dxa" w:w="80"/>
+              <w:left w:type="dxa" w:w="110"/>
+              <w:bottom w:type="dxa" w:w="80"/>
+              <w:right w:type="dxa" w:w="110"/>
+            </w:tcMar>
+            <w:vAlign w:val="top"/>
+          </w:tcPr>
+          <w:p>
+            <w:pPr>
+              <w:spacing w:after="40" w:before="0"/>
+            </w:pPr>
+            <w:r>
+              <w:rPr>
+                <w:rFonts w:ascii="Arial" w:cs="Arial" w:eastAsia="Microsoft YaHei" w:hAnsi="Arial"/>
+                <w:b/>
+                <w:bCs/>
+                <w:color w:val="E8590C"/>
+                <w:sz w:val="17"/>
+                <w:szCs w:val="17"/>
+              </w:rPr>
+              <w:t xml:space="preserve">E-32</w:t>
+            </w:r>
+          </w:p>
+        </w:tc>
+        <w:tc>
+          <w:tcPr>
+            <w:tcW w:type="dxa" w:w="2700"/>
+            <w:tcBorders>
+              <w:top w:val="single" w:color="D1D5DB" w:sz="4"/>
+              <w:left w:val="single" w:color="D1D5DB" w:sz="4"/>
+              <w:bottom w:val="single" w:color="D1D5DB" w:sz="4"/>
+              <w:right w:val="single" w:color="D1D5DB" w:sz="4"/>
+            </w:tcBorders>
+            <w:tcMar>
+              <w:top w:type="dxa" w:w="80"/>
+              <w:left w:type="dxa" w:w="110"/>
+              <w:bottom w:type="dxa" w:w="80"/>
+              <w:right w:type="dxa" w:w="110"/>
+            </w:tcMar>
+            <w:vAlign w:val="top"/>
+          </w:tcPr>
+          <w:p>
+            <w:pPr>
+              <w:spacing w:after="40" w:before="0"/>
+            </w:pPr>
+            <w:r>
+              <w:rPr>
+                <w:rFonts w:ascii="Arial" w:cs="Arial" w:eastAsia="Microsoft YaHei" w:hAnsi="Arial"/>
+                <w:sz w:val="18"/>
+                <w:szCs w:val="18"/>
+              </w:rPr>
+              <w:t xml:space="preserve">地址 Address</w:t>
+            </w:r>
+          </w:p>
+        </w:tc>
+        <w:tc>
+          <w:tcPr>
+            <w:tcW w:type="dxa" w:w="4550"/>
+            <w:tcBorders>
+              <w:top w:val="single" w:color="D1D5DB" w:sz="4"/>
+              <w:left w:val="single" w:color="D1D5DB" w:sz="4"/>
+              <w:bottom w:val="single" w:color="D1D5DB" w:sz="4"/>
+              <w:right w:val="single" w:color="D1D5DB" w:sz="4"/>
+            </w:tcBorders>
+            <w:tcMar>
+              <w:top w:type="dxa" w:w="80"/>
+              <w:left w:type="dxa" w:w="110"/>
+              <w:bottom w:type="dxa" w:w="80"/>
+              <w:right w:type="dxa" w:w="110"/>
+            </w:tcMar>
+            <w:vAlign w:val="top"/>
+          </w:tcPr>
+          <w:p>
+            <w:pPr>
+              <w:spacing w:after="40" w:before="0"/>
+            </w:pPr>
+            <w:r>
+              <w:rPr>
+                <w:rFonts w:ascii="Arial" w:cs="Arial" w:eastAsia="Microsoft YaHei" w:hAnsi="Arial"/>
+                <w:i w:val="false"/>
+                <w:iCs w:val="false"/>
+                <w:color w:val="1F2328"/>
+                <w:sz w:val="19"/>
+                <w:szCs w:val="19"/>
+              </w:rPr>
+              <w:t xml:space="preserve">Address coming soon（占位）</w:t>
+            </w:r>
+          </w:p>
+        </w:tc>
+        <w:tc>
+          <w:tcPr>
+            <w:tcW w:type="dxa" w:w="5238"/>
+            <w:tcBorders>
+              <w:top w:val="single" w:color="D1D5DB" w:sz="4"/>
+              <w:left w:val="single" w:color="D1D5DB" w:sz="4"/>
+              <w:bottom w:val="single" w:color="D1D5DB" w:sz="4"/>
+              <w:right w:val="single" w:color="D1D5DB" w:sz="4"/>
+            </w:tcBorders>
+            <w:shd w:fill="FFF8E7" w:color="auto" w:val="clear"/>
+            <w:tcMar>
+              <w:top w:type="dxa" w:w="80"/>
+              <w:left w:type="dxa" w:w="110"/>
+              <w:bottom w:type="dxa" w:w="80"/>
+              <w:right w:type="dxa" w:w="110"/>
+            </w:tcMar>
+            <w:vAlign w:val="top"/>
+          </w:tcPr>
+          <w:p>
+            <w:pPr>
+              <w:spacing w:after="40" w:before="0"/>
+            </w:pPr>
+            <w:r>
+              <w:rPr>
+                <w:rFonts w:ascii="Arial" w:cs="Arial" w:eastAsia="Microsoft YaHei" w:hAnsi="Arial"/>
+                <w:b/>
+                <w:bCs/>
+                <w:color w:val="E8590C"/>
+                <w:sz w:val="17"/>
+                <w:szCs w:val="17"/>
+              </w:rPr>
+              <w:t xml:space="preserve">【请填写】</w:t>
+            </w:r>
+            <w:r>
+              <w:rPr>
+                <w:rFonts w:ascii="Arial" w:cs="Arial" w:eastAsia="Microsoft YaHei" w:hAnsi="Arial"/>
+                <w:color w:val="1D4ED8"/>
+                <w:sz w:val="19"/>
+                <w:szCs w:val="19"/>
+              </w:rPr>
+              <w:t xml:space="preserve">Street address, City, State ZIP</w:t>
+            </w:r>
+          </w:p>
+        </w:tc>
+        <w:tc>
+          <w:tcPr>
+            <w:tcW w:type="dxa" w:w="1400"/>
+            <w:tcBorders>
+              <w:top w:val="single" w:color="D1D5DB" w:sz="4"/>
+              <w:left w:val="single" w:color="D1D5DB" w:sz="4"/>
+              <w:bottom w:val="single" w:color="D1D5DB" w:sz="4"/>
+              <w:right w:val="single" w:color="D1D5DB" w:sz="4"/>
+            </w:tcBorders>
+            <w:shd w:fill="FDE8E8" w:color="auto" w:val="clear"/>
+            <w:tcMar>
+              <w:top w:type="dxa" w:w="80"/>
+              <w:left w:type="dxa" w:w="110"/>
+              <w:bottom w:type="dxa" w:w="80"/>
+              <w:right w:type="dxa" w:w="110"/>
+            </w:tcMar>
+            <w:vAlign w:val="top"/>
+          </w:tcPr>
+          <w:p>
+            <w:pPr>
+              <w:spacing w:after="40" w:before="0"/>
+            </w:pPr>
+            <w:r>
+              <w:rPr>
+                <w:rFonts w:ascii="Arial" w:cs="Arial" w:eastAsia="Microsoft YaHei" w:hAnsi="Arial"/>
+                <w:b/>
+                <w:bCs/>
+                <w:color w:val="B91C1C"/>
+                <w:sz w:val="17"/>
+                <w:szCs w:val="17"/>
+              </w:rPr>
+              <w:t xml:space="preserve">必填 Required</w:t>
+            </w:r>
+          </w:p>
+        </w:tc>
+      </w:tr>
+      <w:tr>
+        <w:trPr>
+          <w:cantSplit/>
+        </w:trPr>
+        <w:tc>
+          <w:tcPr>
+            <w:tcW w:type="dxa" w:w="950"/>
+            <w:tcBorders>
+              <w:top w:val="single" w:color="D1D5DB" w:sz="4"/>
+              <w:left w:val="single" w:color="D1D5DB" w:sz="4"/>
+              <w:bottom w:val="single" w:color="D1D5DB" w:sz="4"/>
+              <w:right w:val="single" w:color="D1D5DB" w:sz="4"/>
+            </w:tcBorders>
+            <w:tcMar>
+              <w:top w:type="dxa" w:w="80"/>
+              <w:left w:type="dxa" w:w="110"/>
+              <w:bottom w:type="dxa" w:w="80"/>
+              <w:right w:type="dxa" w:w="110"/>
+            </w:tcMar>
+            <w:vAlign w:val="top"/>
+          </w:tcPr>
+          <w:p>
+            <w:pPr>
+              <w:spacing w:after="40" w:before="0"/>
+            </w:pPr>
+            <w:r>
+              <w:rPr>
+                <w:rFonts w:ascii="Arial" w:cs="Arial" w:eastAsia="Microsoft YaHei" w:hAnsi="Arial"/>
+                <w:b/>
+                <w:bCs/>
+                <w:color w:val="E8590C"/>
+                <w:sz w:val="17"/>
+                <w:szCs w:val="17"/>
+              </w:rPr>
+              <w:t xml:space="preserve">E-33</w:t>
+            </w:r>
+          </w:p>
+        </w:tc>
+        <w:tc>
+          <w:tcPr>
+            <w:tcW w:type="dxa" w:w="2700"/>
+            <w:tcBorders>
+              <w:top w:val="single" w:color="D1D5DB" w:sz="4"/>
+              <w:left w:val="single" w:color="D1D5DB" w:sz="4"/>
+              <w:bottom w:val="single" w:color="D1D5DB" w:sz="4"/>
+              <w:right w:val="single" w:color="D1D5DB" w:sz="4"/>
+            </w:tcBorders>
+            <w:tcMar>
+              <w:top w:type="dxa" w:w="80"/>
+              <w:left w:type="dxa" w:w="110"/>
+              <w:bottom w:type="dxa" w:w="80"/>
+              <w:right w:type="dxa" w:w="110"/>
+            </w:tcMar>
+            <w:vAlign w:val="top"/>
+          </w:tcPr>
+          <w:p>
+            <w:pPr>
+              <w:spacing w:after="40" w:before="0"/>
+            </w:pPr>
+            <w:r>
+              <w:rPr>
+                <w:rFonts w:ascii="Arial" w:cs="Arial" w:eastAsia="Microsoft YaHei" w:hAnsi="Arial"/>
+                <w:sz w:val="18"/>
+                <w:szCs w:val="18"/>
+              </w:rPr>
+              <w:t xml:space="preserve">训练时间 Training hours</w:t>
+            </w:r>
+          </w:p>
+        </w:tc>
+        <w:tc>
+          <w:tcPr>
+            <w:tcW w:type="dxa" w:w="4550"/>
+            <w:tcBorders>
+              <w:top w:val="single" w:color="D1D5DB" w:sz="4"/>
+              <w:left w:val="single" w:color="D1D5DB" w:sz="4"/>
+              <w:bottom w:val="single" w:color="D1D5DB" w:sz="4"/>
+              <w:right w:val="single" w:color="D1D5DB" w:sz="4"/>
+            </w:tcBorders>
+            <w:tcMar>
+              <w:top w:type="dxa" w:w="80"/>
+              <w:left w:type="dxa" w:w="110"/>
+              <w:bottom w:type="dxa" w:w="80"/>
+              <w:right w:type="dxa" w:w="110"/>
+            </w:tcMar>
+            <w:vAlign w:val="top"/>
+          </w:tcPr>
+          <w:p>
+            <w:pPr>
+              <w:spacing w:after="40" w:before="0"/>
+            </w:pPr>
+            <w:r>
+              <w:rPr>
+                <w:rFonts w:ascii="Arial" w:cs="Arial" w:eastAsia="Microsoft YaHei" w:hAnsi="Arial"/>
+                <w:i w:val="false"/>
+                <w:iCs w:val="false"/>
+                <w:color w:val="1F2328"/>
+                <w:sz w:val="19"/>
+                <w:szCs w:val="19"/>
+              </w:rPr>
+              <w:t xml:space="preserve">Schedule coming soon（占位）</w:t>
+            </w:r>
+          </w:p>
+          <w:p>
+            <w:pPr>
+              <w:spacing w:after="40" w:before="0"/>
+            </w:pPr>
+            <w:r>
+              <w:rPr>
+                <w:rFonts w:ascii="Arial" w:cs="Arial" w:eastAsia="Microsoft YaHei" w:hAnsi="Arial"/>
+                <w:i/>
+                <w:iCs/>
+                <w:color w:val="6B7280"/>
+                <w:sz w:val="16"/>
+                <w:szCs w:val="16"/>
+              </w:rPr>
+              <w:t xml:space="preserve">说明：可写该校区开设的课程，如 “Volleyball · Mon/Wed 5–7 pm”。</w:t>
+            </w:r>
+          </w:p>
+        </w:tc>
+        <w:tc>
+          <w:tcPr>
+            <w:tcW w:type="dxa" w:w="5238"/>
+            <w:tcBorders>
+              <w:top w:val="single" w:color="D1D5DB" w:sz="4"/>
+              <w:left w:val="single" w:color="D1D5DB" w:sz="4"/>
+              <w:bottom w:val="single" w:color="D1D5DB" w:sz="4"/>
+              <w:right w:val="single" w:color="D1D5DB" w:sz="4"/>
+            </w:tcBorders>
+            <w:shd w:fill="FFF8E7" w:color="auto" w:val="clear"/>
+            <w:tcMar>
+              <w:top w:type="dxa" w:w="80"/>
+              <w:left w:type="dxa" w:w="110"/>
+              <w:bottom w:type="dxa" w:w="80"/>
+              <w:right w:type="dxa" w:w="110"/>
+            </w:tcMar>
+            <w:vAlign w:val="top"/>
+          </w:tcPr>
+          <w:p>
+            <w:pPr>
+              <w:spacing w:after="40" w:before="0"/>
+            </w:pPr>
+            <w:r>
+              <w:rPr>
+                <w:rFonts w:ascii="Arial" w:cs="Arial" w:eastAsia="Microsoft YaHei" w:hAnsi="Arial"/>
+                <w:b/>
+                <w:bCs/>
+                <w:color w:val="E8590C"/>
+                <w:sz w:val="17"/>
+                <w:szCs w:val="17"/>
+              </w:rPr>
+              <w:t xml:space="preserve">【示例】</w:t>
+            </w:r>
+            <w:r>
+              <w:rPr>
+                <w:rFonts w:ascii="Arial" w:cs="Arial" w:eastAsia="Microsoft YaHei" w:hAnsi="Arial"/>
+                <w:color w:val="1D4ED8"/>
+                <w:sz w:val="19"/>
+                <w:szCs w:val="19"/>
+              </w:rPr>
+              <w:t xml:space="preserve">Mon–Fri 4–8 pm · Sat 9 am–3 pm</w:t>
+            </w:r>
+          </w:p>
+        </w:tc>
+        <w:tc>
+          <w:tcPr>
+            <w:tcW w:type="dxa" w:w="1400"/>
+            <w:tcBorders>
+              <w:top w:val="single" w:color="D1D5DB" w:sz="4"/>
+              <w:left w:val="single" w:color="D1D5DB" w:sz="4"/>
+              <w:bottom w:val="single" w:color="D1D5DB" w:sz="4"/>
+              <w:right w:val="single" w:color="D1D5DB" w:sz="4"/>
+            </w:tcBorders>
+            <w:shd w:fill="FDE8E8" w:color="auto" w:val="clear"/>
+            <w:tcMar>
+              <w:top w:type="dxa" w:w="80"/>
+              <w:left w:type="dxa" w:w="110"/>
+              <w:bottom w:type="dxa" w:w="80"/>
+              <w:right w:type="dxa" w:w="110"/>
+            </w:tcMar>
+            <w:vAlign w:val="top"/>
+          </w:tcPr>
+          <w:p>
+            <w:pPr>
+              <w:spacing w:after="40" w:before="0"/>
+            </w:pPr>
+            <w:r>
+              <w:rPr>
+                <w:rFonts w:ascii="Arial" w:cs="Arial" w:eastAsia="Microsoft YaHei" w:hAnsi="Arial"/>
+                <w:b/>
+                <w:bCs/>
+                <w:color w:val="B91C1C"/>
+                <w:sz w:val="17"/>
+                <w:szCs w:val="17"/>
+              </w:rPr>
+              <w:t xml:space="preserve">必填 Required</w:t>
+            </w:r>
+          </w:p>
+        </w:tc>
+      </w:tr>
+      <w:tr>
+        <w:trPr>
+          <w:cantSplit/>
+        </w:trPr>
+        <w:tc>
+          <w:tcPr>
+            <w:tcW w:type="dxa" w:w="950"/>
+            <w:tcBorders>
+              <w:top w:val="single" w:color="D1D5DB" w:sz="4"/>
+              <w:left w:val="single" w:color="D1D5DB" w:sz="4"/>
+              <w:bottom w:val="single" w:color="D1D5DB" w:sz="4"/>
+              <w:right w:val="single" w:color="D1D5DB" w:sz="4"/>
+            </w:tcBorders>
+            <w:tcMar>
+              <w:top w:type="dxa" w:w="80"/>
+              <w:left w:type="dxa" w:w="110"/>
+              <w:bottom w:type="dxa" w:w="80"/>
+              <w:right w:type="dxa" w:w="110"/>
+            </w:tcMar>
+            <w:vAlign w:val="top"/>
+          </w:tcPr>
+          <w:p>
+            <w:pPr>
+              <w:spacing w:after="40" w:before="0"/>
+            </w:pPr>
+            <w:r>
+              <w:rPr>
+                <w:rFonts w:ascii="Arial" w:cs="Arial" w:eastAsia="Microsoft YaHei" w:hAnsi="Arial"/>
+                <w:b/>
+                <w:bCs/>
+                <w:color w:val="E8590C"/>
+                <w:sz w:val="17"/>
+                <w:szCs w:val="17"/>
+              </w:rPr>
+              <w:t xml:space="preserve">E-34</w:t>
+            </w:r>
+          </w:p>
+        </w:tc>
+        <w:tc>
+          <w:tcPr>
+            <w:tcW w:type="dxa" w:w="2700"/>
+            <w:tcBorders>
+              <w:top w:val="single" w:color="D1D5DB" w:sz="4"/>
+              <w:left w:val="single" w:color="D1D5DB" w:sz="4"/>
+              <w:bottom w:val="single" w:color="D1D5DB" w:sz="4"/>
+              <w:right w:val="single" w:color="D1D5DB" w:sz="4"/>
+            </w:tcBorders>
+            <w:tcMar>
+              <w:top w:type="dxa" w:w="80"/>
+              <w:left w:type="dxa" w:w="110"/>
+              <w:bottom w:type="dxa" w:w="80"/>
+              <w:right w:type="dxa" w:w="110"/>
+            </w:tcMar>
+            <w:vAlign w:val="top"/>
+          </w:tcPr>
+          <w:p>
+            <w:pPr>
+              <w:spacing w:after="40" w:before="0"/>
+            </w:pPr>
+            <w:r>
+              <w:rPr>
+                <w:rFonts w:ascii="Arial" w:cs="Arial" w:eastAsia="Microsoft YaHei" w:hAnsi="Arial"/>
+                <w:sz w:val="18"/>
+                <w:szCs w:val="18"/>
+              </w:rPr>
+              <w:t xml:space="preserve">地图链接 Google Maps link</w:t>
+            </w:r>
+          </w:p>
+        </w:tc>
+        <w:tc>
+          <w:tcPr>
+            <w:tcW w:type="dxa" w:w="4550"/>
+            <w:tcBorders>
+              <w:top w:val="single" w:color="D1D5DB" w:sz="4"/>
+              <w:left w:val="single" w:color="D1D5DB" w:sz="4"/>
+              <w:bottom w:val="single" w:color="D1D5DB" w:sz="4"/>
+              <w:right w:val="single" w:color="D1D5DB" w:sz="4"/>
+            </w:tcBorders>
+            <w:tcMar>
+              <w:top w:type="dxa" w:w="80"/>
+              <w:left w:type="dxa" w:w="110"/>
+              <w:bottom w:type="dxa" w:w="80"/>
+              <w:right w:type="dxa" w:w="110"/>
+            </w:tcMar>
+            <w:vAlign w:val="top"/>
+          </w:tcPr>
+          <w:p>
+            <w:pPr>
+              <w:spacing w:after="40" w:before="0"/>
+            </w:pPr>
+            <w:r>
+              <w:rPr>
+                <w:rFonts w:ascii="Arial" w:cs="Arial" w:eastAsia="Microsoft YaHei" w:hAnsi="Arial"/>
+                <w:i/>
+                <w:iCs/>
+                <w:color w:val="6B7280"/>
+                <w:sz w:val="19"/>
+                <w:szCs w:val="19"/>
+              </w:rPr>
+              <w:t xml:space="preserve">（目前未展示）</w:t>
+            </w:r>
+          </w:p>
+          <w:p>
+            <w:pPr>
+              <w:spacing w:after="40" w:before="0"/>
+            </w:pPr>
+            <w:r>
+              <w:rPr>
+                <w:rFonts w:ascii="Arial" w:cs="Arial" w:eastAsia="Microsoft YaHei" w:hAnsi="Arial"/>
+                <w:i/>
+                <w:iCs/>
+                <w:color w:val="6B7280"/>
+                <w:sz w:val="16"/>
+                <w:szCs w:val="16"/>
+              </w:rPr>
+              <w:t xml:space="preserve">说明：在 Google Maps 搜到场馆 → 分享 → 复制链接。提供后会显示 “Directions ↗” 按钮。</w:t>
+            </w:r>
+          </w:p>
+        </w:tc>
+        <w:tc>
+          <w:tcPr>
+            <w:tcW w:type="dxa" w:w="5238"/>
+            <w:tcBorders>
+              <w:top w:val="single" w:color="D1D5DB" w:sz="4"/>
+              <w:left w:val="single" w:color="D1D5DB" w:sz="4"/>
+              <w:bottom w:val="single" w:color="D1D5DB" w:sz="4"/>
+              <w:right w:val="single" w:color="D1D5DB" w:sz="4"/>
+            </w:tcBorders>
+            <w:shd w:fill="FFF8E7" w:color="auto" w:val="clear"/>
+            <w:tcMar>
+              <w:top w:type="dxa" w:w="80"/>
+              <w:left w:type="dxa" w:w="110"/>
+              <w:bottom w:type="dxa" w:w="80"/>
+              <w:right w:type="dxa" w:w="110"/>
+            </w:tcMar>
+            <w:vAlign w:val="top"/>
+          </w:tcPr>
+          <w:p>
+            <w:pPr>
+              <w:spacing w:after="40" w:before="0"/>
+            </w:pPr>
+            <w:r>
+              <w:rPr>
+                <w:rFonts w:ascii="Arial" w:cs="Arial" w:eastAsia="Microsoft YaHei" w:hAnsi="Arial"/>
+                <w:b/>
+                <w:bCs/>
+                <w:color w:val="E8590C"/>
+                <w:sz w:val="17"/>
+                <w:szCs w:val="17"/>
+              </w:rPr>
+              <w:t xml:space="preserve">【请填写】</w:t>
+            </w:r>
+            <w:r>
+              <w:rPr>
+                <w:rFonts w:ascii="Arial" w:cs="Arial" w:eastAsia="Microsoft YaHei" w:hAnsi="Arial"/>
+                <w:color w:val="1D4ED8"/>
+                <w:sz w:val="19"/>
+                <w:szCs w:val="19"/>
+              </w:rPr>
+              <w:t xml:space="preserve">https://maps.app.goo.gl/…</w:t>
+            </w:r>
+          </w:p>
+        </w:tc>
+        <w:tc>
+          <w:tcPr>
+            <w:tcW w:type="dxa" w:w="1400"/>
+            <w:tcBorders>
+              <w:top w:val="single" w:color="D1D5DB" w:sz="4"/>
+              <w:left w:val="single" w:color="D1D5DB" w:sz="4"/>
+              <w:bottom w:val="single" w:color="D1D5DB" w:sz="4"/>
+              <w:right w:val="single" w:color="D1D5DB" w:sz="4"/>
+            </w:tcBorders>
+            <w:shd w:fill="E0ECFF" w:color="auto" w:val="clear"/>
+            <w:tcMar>
+              <w:top w:type="dxa" w:w="80"/>
+              <w:left w:type="dxa" w:w="110"/>
+              <w:bottom w:type="dxa" w:w="80"/>
+              <w:right w:type="dxa" w:w="110"/>
+            </w:tcMar>
+            <w:vAlign w:val="top"/>
+          </w:tcPr>
+          <w:p>
+            <w:pPr>
+              <w:spacing w:after="40" w:before="0"/>
+            </w:pPr>
+            <w:r>
+              <w:rPr>
+                <w:rFonts w:ascii="Arial" w:cs="Arial" w:eastAsia="Microsoft YaHei" w:hAnsi="Arial"/>
+                <w:b/>
+                <w:bCs/>
+                <w:color w:val="1D4ED8"/>
+                <w:sz w:val="17"/>
+                <w:szCs w:val="17"/>
+              </w:rPr>
+              <w:t xml:space="preserve">新增 New</w:t>
+            </w:r>
+          </w:p>
+        </w:tc>
+      </w:tr>
+    </w:tbl>
+    <w:p>
+      <w:pPr>
+        <w:spacing w:after="60"/>
+      </w:pPr>
+    </w:p>
+    <w:p>
+      <w:pPr>
+        <w:spacing w:after="40" w:before="0"/>
+      </w:pPr>
+      <w:r>
+        <w:rPr>
+          <w:rFonts w:ascii="Arial" w:cs="Arial" w:eastAsia="Microsoft YaHei" w:hAnsi="Arial"/>
+          <w:i/>
+          <w:iCs/>
+          <w:color w:val="6B7280"/>
+          <w:sz w:val="19"/>
+          <w:szCs w:val="19"/>
+        </w:rPr>
+        <w:t xml:space="preserve">如校区数量有变化（增加或减少），请在下方说明：Add or remove campuses here:</w:t>
+      </w:r>
+    </w:p>
+    <w:tbl>
+      <w:tblPr>
+        <w:tblW w:type="dxa" w:w="14838"/>
+        <w:tblBorders>
+          <w:top w:val="single" w:color="auto" w:sz="4"/>
+          <w:left w:val="single" w:color="auto" w:sz="4"/>
+          <w:bottom w:val="single" w:color="auto" w:sz="4"/>
+          <w:right w:val="single" w:color="auto" w:sz="4"/>
+          <w:insideH w:val="single" w:color="auto" w:sz="4"/>
+          <w:insideV w:val="single" w:color="auto" w:sz="4"/>
+        </w:tblBorders>
+      </w:tblPr>
+      <w:tblGrid>
+        <w:gridCol w:w="14838"/>
+      </w:tblGrid>
+      <w:tr>
+        <w:trPr>
+          <w:trHeight w:val="900" w:hRule="atLeast"/>
+        </w:trPr>
+        <w:tc>
+          <w:tcPr>
+            <w:tcW w:type="dxa" w:w="14838"/>
+            <w:tcBorders>
+              <w:top w:val="single" w:color="D1D5DB" w:sz="4"/>
+              <w:left w:val="single" w:color="D1D5DB" w:sz="4"/>
+              <w:bottom w:val="single" w:color="D1D5DB" w:sz="4"/>
+              <w:right w:val="single" w:color="D1D5DB" w:sz="4"/>
+            </w:tcBorders>
+            <w:shd w:fill="FFF8E7" w:color="auto" w:val="clear"/>
+            <w:tcMar>
+              <w:top w:type="dxa" w:w="80"/>
+              <w:left w:type="dxa" w:w="110"/>
+              <w:bottom w:type="dxa" w:w="80"/>
+              <w:right w:type="dxa" w:w="110"/>
+            </w:tcMar>
+            <w:vAlign w:val="top"/>
+          </w:tcPr>
+          <w:p>
+            <w:pPr>
+              <w:spacing w:after="40" w:before="0"/>
+            </w:pPr>
+            <w:r>
+              <w:rPr>
+                <w:rFonts w:ascii="Arial" w:cs="Arial" w:eastAsia="Microsoft YaHei" w:hAnsi="Arial"/>
+                <w:sz w:val="19"/>
+                <w:szCs w:val="19"/>
+              </w:rPr>
+              <w:t xml:space="preserve"/>
             </w:r>
           </w:p>
         </w:tc>
@@ -17579,7 +20261,7 @@
                 <w:sz w:val="18"/>
                 <w:szCs w:val="18"/>
               </w:rPr>
-              <w:t xml:space="preserve">地址 Campus</w:t>
+              <w:t xml:space="preserve">校区 Campuses</w:t>
             </w:r>
           </w:p>
         </w:tc>
@@ -17613,7 +20295,7 @@
                 <w:sz w:val="19"/>
                 <w:szCs w:val="19"/>
               </w:rPr>
-              <w:t xml:space="preserve">Address coming soon（占位）</w:t>
+              <w:t xml:space="preserve">3 locations — see addresses（自动链接到校区区块）</w:t>
             </w:r>
           </w:p>
           <w:p>
@@ -17629,7 +20311,7 @@
                 <w:sz w:val="16"/>
                 <w:szCs w:val="16"/>
               </w:rPr>
-              <w:t xml:space="preserve">说明：通常与 E-04 相同。</w:t>
+              <w:t xml:space="preserve">说明：地址统一在 E 部分填写，这里无需重复。</w:t>
             </w:r>
           </w:p>
         </w:tc>
@@ -17674,29 +20356,29 @@
               <w:bottom w:val="single" w:color="D1D5DB" w:sz="4"/>
               <w:right w:val="single" w:color="D1D5DB" w:sz="4"/>
             </w:tcBorders>
-            <w:shd w:fill="FDE8E8" w:color="auto" w:val="clear"/>
-            <w:tcMar>
-              <w:top w:type="dxa" w:w="80"/>
-              <w:left w:type="dxa" w:w="110"/>
-              <w:bottom w:type="dxa" w:w="80"/>
-              <w:right w:type="dxa" w:w="110"/>
-            </w:tcMar>
-            <w:vAlign w:val="top"/>
-          </w:tcPr>
-          <w:p>
-            <w:pPr>
-              <w:spacing w:after="40" w:before="0"/>
-            </w:pPr>
-            <w:r>
-              <w:rPr>
-                <w:rFonts w:ascii="Arial" w:cs="Arial" w:eastAsia="Microsoft YaHei" w:hAnsi="Arial"/>
-                <w:b/>
-                <w:bCs/>
-                <w:color w:val="B91C1C"/>
-                <w:sz w:val="17"/>
-                <w:szCs w:val="17"/>
-              </w:rPr>
-              <w:t xml:space="preserve">必填 Required</w:t>
+            <w:shd w:fill="F3F4F6" w:color="auto" w:val="clear"/>
+            <w:tcMar>
+              <w:top w:type="dxa" w:w="80"/>
+              <w:left w:type="dxa" w:w="110"/>
+              <w:bottom w:type="dxa" w:w="80"/>
+              <w:right w:type="dxa" w:w="110"/>
+            </w:tcMar>
+            <w:vAlign w:val="top"/>
+          </w:tcPr>
+          <w:p>
+            <w:pPr>
+              <w:spacing w:after="40" w:before="0"/>
+            </w:pPr>
+            <w:r>
+              <w:rPr>
+                <w:rFonts w:ascii="Arial" w:cs="Arial" w:eastAsia="Microsoft YaHei" w:hAnsi="Arial"/>
+                <w:b/>
+                <w:bCs/>
+                <w:color w:val="374151"/>
+                <w:sz w:val="17"/>
+                <w:szCs w:val="17"/>
+              </w:rPr>
+              <w:t xml:space="preserve">可选 Optional</w:t>
             </w:r>
           </w:p>
         </w:tc>
@@ -21476,7 +24158,7 @@
                 <w:sz w:val="18"/>
                 <w:szCs w:val="18"/>
               </w:rPr>
-              <w:t xml:space="preserve">场馆照片</w:t>
+              <w:t xml:space="preserve">校区照片（每个校区 1 张，可选）</w:t>
             </w:r>
           </w:p>
           <w:p>
@@ -21534,6 +24216,19 @@
                 <w:szCs w:val="17"/>
               </w:rPr>
               <w:t xml:space="preserve">推荐：场馆外观、入口、场地全景</w:t>
+            </w:r>
+          </w:p>
+          <w:p>
+            <w:pPr>
+              <w:spacing w:after="40" w:before="0"/>
+            </w:pPr>
+            <w:r>
+              <w:rPr>
+                <w:rFonts w:ascii="Arial" w:cs="Arial" w:eastAsia="Microsoft YaHei" w:hAnsi="Arial"/>
+                <w:sz w:val="17"/>
+                <w:szCs w:val="17"/>
+              </w:rPr>
+              <w:t xml:space="preserve">文件名 IMG-09a / 09b / 09c</w:t>
             </w:r>
           </w:p>
         </w:tc>
@@ -21591,7 +24286,7 @@
                 <w:sz w:val="19"/>
                 <w:szCs w:val="19"/>
               </w:rPr>
-              <w:t xml:space="preserve">IMG-09-campus.jpg</w:t>
+              <w:t xml:space="preserve">IMG-09a-campus1.jpg, IMG-09b…, IMG-09c…</w:t>
             </w:r>
           </w:p>
           <w:p>

</xml_diff>

<commit_message>
Switch custom domain to www.theinfinitesports.com
Co-Authored-By: Claude Opus 5.5 <noreply@anthropic.com>
Claude-Session: https://claude.ai/code/session_01MP287J4ytmKJQmpMcNBeyF
</commit_message>
<xml_diff>
--- a/docs/Infinite-Sports-网站内容收集清单.docx
+++ b/docs/Infinite-Sports-网站内容收集清单.docx
@@ -146,7 +146,7 @@
                 <w:sz w:val="19"/>
                 <w:szCs w:val="19"/>
               </w:rPr>
-              <w:t xml:space="preserve">https://www.theinfnitesports.com/（绑定完成前请用 https://steven-zhc.github.io/infinite-sports/）</w:t>
+              <w:t xml:space="preserve">https://www.theinfinitesports.com/（绑定完成前请用 https://steven-zhc.github.io/infinite-sports/）</w:t>
             </w:r>
           </w:p>
         </w:tc>
@@ -417,7 +417,7 @@
                 <w:sz w:val="19"/>
                 <w:szCs w:val="19"/>
               </w:rPr>
-              <w:t xml:space="preserve">v5（3 个校区）· 2026-10-01</w:t>
+              <w:t xml:space="preserve">v6（3 个校区，新域名）· 2026-10-01</w:t>
             </w:r>
           </w:p>
         </w:tc>
@@ -1983,7 +1983,7 @@
                 <w:sz w:val="19"/>
                 <w:szCs w:val="19"/>
               </w:rPr>
-              <w:t xml:space="preserve">www.theinfnitesports.com</w:t>
+              <w:t xml:space="preserve">www.theinfinitesports.com</w:t>
             </w:r>
           </w:p>
         </w:tc>

</xml_diff>